<commit_message>
fix: 331 zero-width tab stops in attorney templates (18 LLC + 313 Corp)
Both templates had tab stops with w:pos="0" causing section numbers
like "1.1" and their headings "Act." to render without visible
separation. Fixed all to w:pos="720" (0.5 inch standard tab width).

Pre-fix backups: llc_template_pre_fix.docx, corp_template_pre_fix.docx
Fix script: scripts/fix-template-formatting.mjs

All 162 verification tests still pass (106 content + 56 video).

Co-Authored-By: Claude Opus 4.6 (1M context) <noreply@anthropic.com>
</commit_message>
<xml_diff>
--- a/templates/corp_template.docx
+++ b/templates/corp_template.docx
@@ -974,8 +974,8 @@
       <w:pPr>
         <w:pStyle w:val="Heading3"/>
         <w:tabs>
-          <w:tab w:val="left" w:leader="none" w:pos="0"/>
-          <w:tab w:val="left" w:leader="none" w:pos="0"/>
+          <w:tab w:val="left" w:leader="none" w:pos="720"/>
+          <w:tab w:val="left" w:leader="none" w:pos="720"/>
         </w:tabs>
         <w:ind w:left="713" w:hanging="720"/>
         <w:jc w:val="both"/>
@@ -993,8 +993,8 @@
       <w:pPr>
         <w:pStyle w:val="Heading3"/>
         <w:tabs>
-          <w:tab w:val="left" w:leader="none" w:pos="0"/>
-          <w:tab w:val="left" w:leader="none" w:pos="0"/>
+          <w:tab w:val="left" w:leader="none" w:pos="720"/>
+          <w:tab w:val="left" w:leader="none" w:pos="720"/>
         </w:tabs>
         <w:ind w:left="713" w:hanging="720"/>
         <w:jc w:val="both"/>
@@ -1128,8 +1128,8 @@
       <w:pPr>
         <w:pStyle w:val="Heading3"/>
         <w:tabs>
-          <w:tab w:val="left" w:leader="none" w:pos="0"/>
-          <w:tab w:val="left" w:leader="none" w:pos="0"/>
+          <w:tab w:val="left" w:leader="none" w:pos="720"/>
+          <w:tab w:val="left" w:leader="none" w:pos="720"/>
         </w:tabs>
         <w:jc w:val="both"/>
         <w:rPr>
@@ -1146,8 +1146,8 @@
       <w:pPr>
         <w:pStyle w:val="Heading3"/>
         <w:tabs>
-          <w:tab w:val="left" w:leader="none" w:pos="0"/>
-          <w:tab w:val="left" w:leader="none" w:pos="0"/>
+          <w:tab w:val="left" w:leader="none" w:pos="720"/>
+          <w:tab w:val="left" w:leader="none" w:pos="720"/>
         </w:tabs>
         <w:ind w:left="719" w:hanging="720"/>
         <w:jc w:val="both"/>
@@ -1198,8 +1198,8 @@
       <w:pPr>
         <w:pStyle w:val="Heading3"/>
         <w:tabs>
-          <w:tab w:val="left" w:leader="none" w:pos="0"/>
-          <w:tab w:val="left" w:leader="none" w:pos="0"/>
+          <w:tab w:val="left" w:leader="none" w:pos="720"/>
+          <w:tab w:val="left" w:leader="none" w:pos="720"/>
         </w:tabs>
         <w:ind w:left="733" w:hanging="720"/>
         <w:jc w:val="both"/>
@@ -1250,8 +1250,8 @@
       <w:pPr>
         <w:pStyle w:val="Heading3"/>
         <w:tabs>
-          <w:tab w:val="left" w:leader="none" w:pos="0"/>
-          <w:tab w:val="left" w:leader="none" w:pos="0"/>
+          <w:tab w:val="left" w:leader="none" w:pos="720"/>
+          <w:tab w:val="left" w:leader="none" w:pos="720"/>
         </w:tabs>
         <w:ind w:left="720" w:firstLine="0"/>
         <w:jc w:val="both"/>
@@ -1270,8 +1270,8 @@
       <w:pPr>
         <w:pStyle w:val="Heading3"/>
         <w:tabs>
-          <w:tab w:val="left" w:leader="none" w:pos="0"/>
-          <w:tab w:val="left" w:leader="none" w:pos="0"/>
+          <w:tab w:val="left" w:leader="none" w:pos="720"/>
+          <w:tab w:val="left" w:leader="none" w:pos="720"/>
         </w:tabs>
         <w:ind w:left="719" w:hanging="720"/>
         <w:jc w:val="both"/>
@@ -1309,8 +1309,8 @@
       <w:pPr>
         <w:pStyle w:val="Heading3"/>
         <w:tabs>
-          <w:tab w:val="left" w:leader="none" w:pos="0"/>
-          <w:tab w:val="left" w:leader="none" w:pos="0"/>
+          <w:tab w:val="left" w:leader="none" w:pos="720"/>
+          <w:tab w:val="left" w:leader="none" w:pos="720"/>
         </w:tabs>
         <w:jc w:val="both"/>
         <w:rPr>
@@ -1328,8 +1328,8 @@
       <w:pPr>
         <w:pStyle w:val="Heading3"/>
         <w:tabs>
-          <w:tab w:val="left" w:leader="none" w:pos="0"/>
-          <w:tab w:val="left" w:leader="none" w:pos="0"/>
+          <w:tab w:val="left" w:leader="none" w:pos="720"/>
+          <w:tab w:val="left" w:leader="none" w:pos="720"/>
         </w:tabs>
         <w:ind w:left="753" w:hanging="720"/>
         <w:jc w:val="both"/>
@@ -1367,8 +1367,8 @@
       <w:pPr>
         <w:pStyle w:val="Heading3"/>
         <w:tabs>
-          <w:tab w:val="left" w:leader="none" w:pos="0"/>
-          <w:tab w:val="left" w:leader="none" w:pos="0"/>
+          <w:tab w:val="left" w:leader="none" w:pos="720"/>
+          <w:tab w:val="left" w:leader="none" w:pos="720"/>
         </w:tabs>
         <w:ind w:left="720" w:firstLine="0"/>
         <w:jc w:val="both"/>
@@ -1387,8 +1387,8 @@
       <w:pPr>
         <w:pStyle w:val="Heading3"/>
         <w:tabs>
-          <w:tab w:val="left" w:leader="none" w:pos="0"/>
-          <w:tab w:val="left" w:leader="none" w:pos="0"/>
+          <w:tab w:val="left" w:leader="none" w:pos="720"/>
+          <w:tab w:val="left" w:leader="none" w:pos="720"/>
         </w:tabs>
         <w:ind w:left="787" w:hanging="720"/>
         <w:jc w:val="both"/>
@@ -1424,8 +1424,8 @@
       <w:pPr>
         <w:pStyle w:val="Heading3"/>
         <w:tabs>
-          <w:tab w:val="left" w:leader="none" w:pos="0"/>
-          <w:tab w:val="left" w:leader="none" w:pos="0"/>
+          <w:tab w:val="left" w:leader="none" w:pos="720"/>
+          <w:tab w:val="left" w:leader="none" w:pos="720"/>
         </w:tabs>
         <w:ind w:left="720" w:firstLine="0"/>
         <w:jc w:val="both"/>
@@ -1444,8 +1444,8 @@
       <w:pPr>
         <w:pStyle w:val="Heading3"/>
         <w:tabs>
-          <w:tab w:val="left" w:leader="none" w:pos="0"/>
-          <w:tab w:val="left" w:leader="none" w:pos="0"/>
+          <w:tab w:val="left" w:leader="none" w:pos="720"/>
+          <w:tab w:val="left" w:leader="none" w:pos="720"/>
         </w:tabs>
         <w:ind w:left="719" w:hanging="720"/>
         <w:jc w:val="both"/>
@@ -1483,8 +1483,8 @@
       <w:pPr>
         <w:pStyle w:val="Heading3"/>
         <w:tabs>
-          <w:tab w:val="left" w:leader="none" w:pos="0"/>
-          <w:tab w:val="left" w:leader="none" w:pos="0"/>
+          <w:tab w:val="left" w:leader="none" w:pos="720"/>
+          <w:tab w:val="left" w:leader="none" w:pos="720"/>
         </w:tabs>
         <w:ind w:left="720" w:firstLine="0"/>
         <w:jc w:val="both"/>
@@ -1503,8 +1503,8 @@
       <w:pPr>
         <w:pStyle w:val="Heading3"/>
         <w:tabs>
-          <w:tab w:val="left" w:leader="none" w:pos="0"/>
-          <w:tab w:val="left" w:leader="none" w:pos="0"/>
+          <w:tab w:val="left" w:leader="none" w:pos="720"/>
+          <w:tab w:val="left" w:leader="none" w:pos="720"/>
         </w:tabs>
         <w:ind w:left="726" w:hanging="720"/>
         <w:jc w:val="both"/>
@@ -1559,8 +1559,8 @@
       <w:pPr>
         <w:pStyle w:val="Heading3"/>
         <w:tabs>
-          <w:tab w:val="left" w:leader="none" w:pos="0"/>
-          <w:tab w:val="left" w:leader="none" w:pos="0"/>
+          <w:tab w:val="left" w:leader="none" w:pos="720"/>
+          <w:tab w:val="left" w:leader="none" w:pos="720"/>
         </w:tabs>
         <w:ind w:left="720" w:firstLine="0"/>
         <w:jc w:val="both"/>
@@ -1579,8 +1579,8 @@
       <w:pPr>
         <w:pStyle w:val="Heading3"/>
         <w:tabs>
-          <w:tab w:val="left" w:leader="none" w:pos="0"/>
-          <w:tab w:val="left" w:leader="none" w:pos="0"/>
+          <w:tab w:val="left" w:leader="none" w:pos="720"/>
+          <w:tab w:val="left" w:leader="none" w:pos="720"/>
         </w:tabs>
         <w:ind w:left="719" w:hanging="720"/>
         <w:jc w:val="both"/>
@@ -1710,8 +1710,8 @@
       <w:pPr>
         <w:pStyle w:val="Heading3"/>
         <w:tabs>
-          <w:tab w:val="left" w:leader="none" w:pos="0"/>
-          <w:tab w:val="left" w:leader="none" w:pos="0"/>
+          <w:tab w:val="left" w:leader="none" w:pos="720"/>
+          <w:tab w:val="left" w:leader="none" w:pos="720"/>
           <w:tab w:val="left" w:leader="none" w:pos="1440"/>
           <w:tab w:val="left" w:leader="none" w:pos="2861"/>
         </w:tabs>
@@ -1756,8 +1756,8 @@
       <w:pPr>
         <w:pStyle w:val="Heading3"/>
         <w:tabs>
-          <w:tab w:val="left" w:leader="none" w:pos="0"/>
-          <w:tab w:val="left" w:leader="none" w:pos="0"/>
+          <w:tab w:val="left" w:leader="none" w:pos="720"/>
+          <w:tab w:val="left" w:leader="none" w:pos="720"/>
           <w:tab w:val="left" w:leader="none" w:pos="1440"/>
           <w:tab w:val="left" w:leader="none" w:pos="2843"/>
         </w:tabs>
@@ -1802,8 +1802,8 @@
       <w:pPr>
         <w:pStyle w:val="Heading3"/>
         <w:tabs>
-          <w:tab w:val="left" w:leader="none" w:pos="0"/>
-          <w:tab w:val="left" w:leader="none" w:pos="0"/>
+          <w:tab w:val="left" w:leader="none" w:pos="720"/>
+          <w:tab w:val="left" w:leader="none" w:pos="720"/>
         </w:tabs>
         <w:ind w:left="1440" w:hanging="720"/>
         <w:jc w:val="both"/>
@@ -1862,7 +1862,7 @@
       <w:pPr>
         <w:pStyle w:val="Heading3"/>
         <w:tabs>
-          <w:tab w:val="left" w:leader="none" w:pos="0"/>
+          <w:tab w:val="left" w:leader="none" w:pos="720"/>
           <w:tab w:val="left" w:leader="none" w:pos="720"/>
         </w:tabs>
         <w:ind w:left="1440" w:hanging="720"/>
@@ -2029,8 +2029,8 @@
       <w:pPr>
         <w:pStyle w:val="Heading3"/>
         <w:tabs>
-          <w:tab w:val="left" w:leader="none" w:pos="0"/>
-          <w:tab w:val="left" w:leader="none" w:pos="0"/>
+          <w:tab w:val="left" w:leader="none" w:pos="720"/>
+          <w:tab w:val="left" w:leader="none" w:pos="720"/>
           <w:tab w:val="left" w:leader="none" w:pos="1440"/>
         </w:tabs>
         <w:ind w:left="1440" w:hanging="720"/>
@@ -2075,8 +2075,8 @@
       <w:pPr>
         <w:pStyle w:val="Heading3"/>
         <w:tabs>
-          <w:tab w:val="left" w:leader="none" w:pos="0"/>
-          <w:tab w:val="left" w:leader="none" w:pos="0"/>
+          <w:tab w:val="left" w:leader="none" w:pos="720"/>
+          <w:tab w:val="left" w:leader="none" w:pos="720"/>
         </w:tabs>
         <w:jc w:val="both"/>
         <w:rPr>
@@ -2127,8 +2127,8 @@
         </w:pBdr>
         <w:shd w:fill="auto" w:val="clear"/>
         <w:tabs>
-          <w:tab w:val="left" w:leader="none" w:pos="0"/>
-          <w:tab w:val="left" w:leader="none" w:pos="0"/>
+          <w:tab w:val="left" w:leader="none" w:pos="720"/>
+          <w:tab w:val="left" w:leader="none" w:pos="720"/>
         </w:tabs>
         <w:spacing w:after="0" w:before="0" w:line="240" w:lineRule="auto"/>
         <w:ind w:left="2160" w:right="0" w:hanging="720"/>
@@ -2235,7 +2235,7 @@
         </w:pBdr>
         <w:shd w:fill="auto" w:val="clear"/>
         <w:tabs>
-          <w:tab w:val="left" w:leader="none" w:pos="0"/>
+          <w:tab w:val="left" w:leader="none" w:pos="720"/>
           <w:tab w:val="left" w:leader="none" w:pos="2889"/>
           <w:tab w:val="left" w:leader="none" w:pos="7177"/>
         </w:tabs>
@@ -2293,7 +2293,7 @@
         </w:pBdr>
         <w:shd w:fill="auto" w:val="clear"/>
         <w:tabs>
-          <w:tab w:val="left" w:leader="none" w:pos="0"/>
+          <w:tab w:val="left" w:leader="none" w:pos="720"/>
           <w:tab w:val="left" w:leader="none" w:pos="2923"/>
           <w:tab w:val="left" w:leader="none" w:pos="7117"/>
         </w:tabs>
@@ -2351,7 +2351,7 @@
         </w:pBdr>
         <w:shd w:fill="auto" w:val="clear"/>
         <w:tabs>
-          <w:tab w:val="left" w:leader="none" w:pos="0"/>
+          <w:tab w:val="left" w:leader="none" w:pos="720"/>
           <w:tab w:val="left" w:leader="none" w:pos="2917"/>
           <w:tab w:val="left" w:leader="none" w:pos="7153"/>
         </w:tabs>
@@ -2422,8 +2422,8 @@
         </w:pBdr>
         <w:shd w:fill="auto" w:val="clear"/>
         <w:tabs>
-          <w:tab w:val="left" w:leader="none" w:pos="0"/>
-          <w:tab w:val="left" w:leader="none" w:pos="0"/>
+          <w:tab w:val="left" w:leader="none" w:pos="720"/>
+          <w:tab w:val="left" w:leader="none" w:pos="720"/>
           <w:tab w:val="left" w:leader="none" w:pos="2160"/>
           <w:tab w:val="left" w:leader="none" w:pos="8640"/>
         </w:tabs>
@@ -2483,8 +2483,8 @@
       <w:pPr>
         <w:pStyle w:val="Heading3"/>
         <w:tabs>
-          <w:tab w:val="left" w:leader="none" w:pos="0"/>
-          <w:tab w:val="left" w:leader="none" w:pos="0"/>
+          <w:tab w:val="left" w:leader="none" w:pos="720"/>
+          <w:tab w:val="left" w:leader="none" w:pos="720"/>
           <w:tab w:val="left" w:leader="none" w:pos="1440"/>
         </w:tabs>
         <w:ind w:left="1440" w:hanging="720"/>
@@ -2527,8 +2527,8 @@
       <w:pPr>
         <w:pStyle w:val="Heading3"/>
         <w:tabs>
-          <w:tab w:val="left" w:leader="none" w:pos="0"/>
-          <w:tab w:val="left" w:leader="none" w:pos="0"/>
+          <w:tab w:val="left" w:leader="none" w:pos="720"/>
+          <w:tab w:val="left" w:leader="none" w:pos="720"/>
           <w:tab w:val="left" w:leader="none" w:pos="1440"/>
         </w:tabs>
         <w:ind w:left="1440" w:hanging="720"/>
@@ -2694,9 +2694,9 @@
       <w:pPr>
         <w:pStyle w:val="Heading3"/>
         <w:tabs>
-          <w:tab w:val="left" w:leader="none" w:pos="0"/>
+          <w:tab w:val="left" w:leader="none" w:pos="720"/>
           <w:tab w:val="left" w:leader="none" w:pos="-360"/>
-          <w:tab w:val="left" w:leader="none" w:pos="0"/>
+          <w:tab w:val="left" w:leader="none" w:pos="720"/>
           <w:tab w:val="left" w:leader="none" w:pos="1440"/>
         </w:tabs>
         <w:ind w:left="1440" w:hanging="720"/>
@@ -2880,8 +2880,8 @@
       <w:pPr>
         <w:pStyle w:val="Heading4"/>
         <w:tabs>
-          <w:tab w:val="left" w:leader="none" w:pos="0"/>
-          <w:tab w:val="left" w:leader="none" w:pos="0"/>
+          <w:tab w:val="left" w:leader="none" w:pos="720"/>
+          <w:tab w:val="left" w:leader="none" w:pos="720"/>
         </w:tabs>
         <w:ind w:left="1440" w:hanging="184.00000000000006"/>
         <w:rPr>
@@ -3041,8 +3041,8 @@
       <w:pPr>
         <w:pStyle w:val="Heading3"/>
         <w:tabs>
-          <w:tab w:val="left" w:leader="none" w:pos="0"/>
-          <w:tab w:val="left" w:leader="none" w:pos="0"/>
+          <w:tab w:val="left" w:leader="none" w:pos="720"/>
+          <w:tab w:val="left" w:leader="none" w:pos="720"/>
           <w:tab w:val="left" w:leader="none" w:pos="1430"/>
           <w:tab w:val="left" w:leader="none" w:pos="2165"/>
         </w:tabs>
@@ -3696,8 +3696,8 @@
       <w:pPr>
         <w:pStyle w:val="Heading3"/>
         <w:tabs>
-          <w:tab w:val="left" w:leader="none" w:pos="0"/>
-          <w:tab w:val="left" w:leader="none" w:pos="0"/>
+          <w:tab w:val="left" w:leader="none" w:pos="720"/>
+          <w:tab w:val="left" w:leader="none" w:pos="720"/>
         </w:tabs>
         <w:ind w:left="726" w:hanging="363"/>
         <w:jc w:val="both"/>
@@ -3987,8 +3987,8 @@
       <w:pPr>
         <w:pStyle w:val="Heading3"/>
         <w:tabs>
-          <w:tab w:val="left" w:leader="none" w:pos="0"/>
-          <w:tab w:val="left" w:leader="none" w:pos="0"/>
+          <w:tab w:val="left" w:leader="none" w:pos="720"/>
+          <w:tab w:val="left" w:leader="none" w:pos="720"/>
           <w:tab w:val="left" w:leader="none" w:pos="1440"/>
           <w:tab w:val="left" w:leader="none" w:pos="1530"/>
           <w:tab w:val="left" w:leader="none" w:pos="4500"/>
@@ -4046,8 +4046,8 @@
         </w:pBdr>
         <w:shd w:fill="auto" w:val="clear"/>
         <w:tabs>
-          <w:tab w:val="left" w:leader="none" w:pos="0"/>
-          <w:tab w:val="left" w:leader="none" w:pos="0"/>
+          <w:tab w:val="left" w:leader="none" w:pos="720"/>
+          <w:tab w:val="left" w:leader="none" w:pos="720"/>
         </w:tabs>
         <w:spacing w:after="0" w:before="0" w:line="240" w:lineRule="auto"/>
         <w:ind w:left="2160" w:right="0" w:hanging="720"/>
@@ -4103,8 +4103,8 @@
         </w:pBdr>
         <w:shd w:fill="auto" w:val="clear"/>
         <w:tabs>
-          <w:tab w:val="left" w:leader="none" w:pos="0"/>
-          <w:tab w:val="left" w:leader="none" w:pos="0"/>
+          <w:tab w:val="left" w:leader="none" w:pos="720"/>
+          <w:tab w:val="left" w:leader="none" w:pos="720"/>
           <w:tab w:val="left" w:leader="none" w:pos="2880"/>
         </w:tabs>
         <w:spacing w:after="0" w:before="0" w:line="240" w:lineRule="auto"/>
@@ -4147,8 +4147,8 @@
         </w:pBdr>
         <w:shd w:fill="auto" w:val="clear"/>
         <w:tabs>
-          <w:tab w:val="left" w:leader="none" w:pos="0"/>
-          <w:tab w:val="left" w:leader="none" w:pos="0"/>
+          <w:tab w:val="left" w:leader="none" w:pos="720"/>
+          <w:tab w:val="left" w:leader="none" w:pos="720"/>
           <w:tab w:val="left" w:leader="none" w:pos="1440"/>
           <w:tab w:val="left" w:leader="none" w:pos="2160"/>
         </w:tabs>
@@ -4206,8 +4206,8 @@
         </w:pBdr>
         <w:shd w:fill="auto" w:val="clear"/>
         <w:tabs>
-          <w:tab w:val="left" w:leader="none" w:pos="0"/>
-          <w:tab w:val="left" w:leader="none" w:pos="0"/>
+          <w:tab w:val="left" w:leader="none" w:pos="720"/>
+          <w:tab w:val="left" w:leader="none" w:pos="720"/>
           <w:tab w:val="left" w:leader="none" w:pos="2880"/>
         </w:tabs>
         <w:spacing w:after="0" w:before="0" w:line="240" w:lineRule="auto"/>
@@ -4250,8 +4250,8 @@
         </w:pBdr>
         <w:shd w:fill="auto" w:val="clear"/>
         <w:tabs>
-          <w:tab w:val="left" w:leader="none" w:pos="0"/>
-          <w:tab w:val="left" w:leader="none" w:pos="0"/>
+          <w:tab w:val="left" w:leader="none" w:pos="720"/>
+          <w:tab w:val="left" w:leader="none" w:pos="720"/>
           <w:tab w:val="left" w:leader="none" w:pos="2160"/>
           <w:tab w:val="left" w:leader="none" w:pos="8640"/>
         </w:tabs>
@@ -4309,9 +4309,9 @@
         </w:pBdr>
         <w:shd w:fill="auto" w:val="clear"/>
         <w:tabs>
-          <w:tab w:val="left" w:leader="none" w:pos="0"/>
+          <w:tab w:val="left" w:leader="none" w:pos="720"/>
           <w:tab w:val="left" w:leader="none" w:pos="-1440"/>
-          <w:tab w:val="left" w:leader="none" w:pos="0"/>
+          <w:tab w:val="left" w:leader="none" w:pos="720"/>
         </w:tabs>
         <w:spacing w:after="0" w:before="0" w:line="240" w:lineRule="auto"/>
         <w:ind w:left="0" w:right="0" w:firstLine="0"/>
@@ -4353,8 +4353,8 @@
         </w:pBdr>
         <w:shd w:fill="auto" w:val="clear"/>
         <w:tabs>
-          <w:tab w:val="left" w:leader="none" w:pos="0"/>
-          <w:tab w:val="left" w:leader="none" w:pos="0"/>
+          <w:tab w:val="left" w:leader="none" w:pos="720"/>
+          <w:tab w:val="left" w:leader="none" w:pos="720"/>
           <w:tab w:val="left" w:leader="none" w:pos="2160"/>
           <w:tab w:val="left" w:leader="none" w:pos="8640"/>
         </w:tabs>
@@ -4412,9 +4412,9 @@
         </w:pBdr>
         <w:shd w:fill="auto" w:val="clear"/>
         <w:tabs>
-          <w:tab w:val="left" w:leader="none" w:pos="0"/>
+          <w:tab w:val="left" w:leader="none" w:pos="720"/>
           <w:tab w:val="left" w:leader="none" w:pos="-1440"/>
-          <w:tab w:val="left" w:leader="none" w:pos="0"/>
+          <w:tab w:val="left" w:leader="none" w:pos="720"/>
         </w:tabs>
         <w:spacing w:after="0" w:before="0" w:line="240" w:lineRule="auto"/>
         <w:ind w:left="0" w:right="0" w:firstLine="0"/>
@@ -4445,8 +4445,8 @@
       <w:pPr>
         <w:pStyle w:val="Heading3"/>
         <w:tabs>
-          <w:tab w:val="left" w:leader="none" w:pos="0"/>
-          <w:tab w:val="left" w:leader="none" w:pos="0"/>
+          <w:tab w:val="left" w:leader="none" w:pos="720"/>
+          <w:tab w:val="left" w:leader="none" w:pos="720"/>
           <w:tab w:val="left" w:leader="none" w:pos="1440"/>
         </w:tabs>
         <w:ind w:left="1440" w:hanging="720"/>
@@ -4490,8 +4490,8 @@
       <w:pPr>
         <w:pStyle w:val="Heading3"/>
         <w:tabs>
-          <w:tab w:val="left" w:leader="none" w:pos="0"/>
-          <w:tab w:val="left" w:leader="none" w:pos="0"/>
+          <w:tab w:val="left" w:leader="none" w:pos="720"/>
+          <w:tab w:val="left" w:leader="none" w:pos="720"/>
           <w:tab w:val="left" w:leader="none" w:pos="1440"/>
         </w:tabs>
         <w:ind w:left="1440" w:hanging="720"/>
@@ -4546,8 +4546,8 @@
         </w:pBdr>
         <w:shd w:fill="auto" w:val="clear"/>
         <w:tabs>
-          <w:tab w:val="left" w:leader="none" w:pos="0"/>
-          <w:tab w:val="left" w:leader="none" w:pos="0"/>
+          <w:tab w:val="left" w:leader="none" w:pos="720"/>
+          <w:tab w:val="left" w:leader="none" w:pos="720"/>
         </w:tabs>
         <w:spacing w:after="0" w:before="0" w:line="240" w:lineRule="auto"/>
         <w:ind w:left="2160" w:right="0" w:hanging="720"/>
@@ -4616,8 +4616,8 @@
         </w:pBdr>
         <w:shd w:fill="auto" w:val="clear"/>
         <w:tabs>
-          <w:tab w:val="left" w:leader="none" w:pos="0"/>
-          <w:tab w:val="left" w:leader="none" w:pos="0"/>
+          <w:tab w:val="left" w:leader="none" w:pos="720"/>
+          <w:tab w:val="left" w:leader="none" w:pos="720"/>
           <w:tab w:val="left" w:leader="none" w:pos="2160"/>
           <w:tab w:val="left" w:leader="none" w:pos="8640"/>
         </w:tabs>
@@ -4788,8 +4788,8 @@
       <w:pPr>
         <w:pStyle w:val="Heading3"/>
         <w:tabs>
-          <w:tab w:val="left" w:leader="none" w:pos="0"/>
-          <w:tab w:val="left" w:leader="none" w:pos="0"/>
+          <w:tab w:val="left" w:leader="none" w:pos="720"/>
+          <w:tab w:val="left" w:leader="none" w:pos="720"/>
         </w:tabs>
         <w:ind w:left="720" w:firstLine="0"/>
         <w:jc w:val="both"/>
@@ -4964,7 +4964,7 @@
     <w:p>
       <w:pPr>
         <w:tabs>
-          <w:tab w:val="left" w:leader="none" w:pos="0"/>
+          <w:tab w:val="left" w:leader="none" w:pos="720"/>
           <w:tab w:val="left" w:leader="none" w:pos="720"/>
           <w:tab w:val="left" w:leader="none" w:pos="1440"/>
           <w:tab w:val="left" w:leader="none" w:pos="2160"/>
@@ -4993,8 +4993,8 @@
       <w:pPr>
         <w:pStyle w:val="Heading3"/>
         <w:tabs>
-          <w:tab w:val="left" w:leader="none" w:pos="0"/>
-          <w:tab w:val="left" w:leader="none" w:pos="0"/>
+          <w:tab w:val="left" w:leader="none" w:pos="720"/>
+          <w:tab w:val="left" w:leader="none" w:pos="720"/>
           <w:tab w:val="left" w:leader="none" w:pos="720"/>
           <w:tab w:val="left" w:leader="none" w:pos="1440"/>
           <w:tab w:val="left" w:leader="none" w:pos="2880"/>
@@ -5031,7 +5031,7 @@
     <w:p>
       <w:pPr>
         <w:tabs>
-          <w:tab w:val="left" w:leader="none" w:pos="0"/>
+          <w:tab w:val="left" w:leader="none" w:pos="720"/>
           <w:tab w:val="left" w:leader="none" w:pos="720"/>
           <w:tab w:val="left" w:leader="none" w:pos="1440"/>
           <w:tab w:val="left" w:leader="none" w:pos="2160"/>
@@ -5071,8 +5071,8 @@
         </w:pBdr>
         <w:shd w:fill="auto" w:val="clear"/>
         <w:tabs>
-          <w:tab w:val="left" w:leader="none" w:pos="0"/>
-          <w:tab w:val="left" w:leader="none" w:pos="0"/>
+          <w:tab w:val="left" w:leader="none" w:pos="720"/>
+          <w:tab w:val="left" w:leader="none" w:pos="720"/>
         </w:tabs>
         <w:spacing w:after="0" w:before="0" w:line="240" w:lineRule="auto"/>
         <w:ind w:left="2160" w:right="0" w:hanging="720"/>
@@ -5116,7 +5116,7 @@
     <w:p>
       <w:pPr>
         <w:tabs>
-          <w:tab w:val="left" w:leader="none" w:pos="0"/>
+          <w:tab w:val="left" w:leader="none" w:pos="720"/>
           <w:tab w:val="left" w:leader="none" w:pos="720"/>
           <w:tab w:val="left" w:leader="none" w:pos="1440"/>
           <w:tab w:val="left" w:leader="none" w:pos="2160"/>
@@ -5156,8 +5156,8 @@
         </w:pBdr>
         <w:shd w:fill="auto" w:val="clear"/>
         <w:tabs>
-          <w:tab w:val="left" w:leader="none" w:pos="0"/>
-          <w:tab w:val="left" w:leader="none" w:pos="0"/>
+          <w:tab w:val="left" w:leader="none" w:pos="720"/>
+          <w:tab w:val="left" w:leader="none" w:pos="720"/>
           <w:tab w:val="left" w:leader="none" w:pos="2160"/>
           <w:tab w:val="left" w:leader="none" w:pos="8640"/>
           <w:tab w:val="left" w:leader="none" w:pos="9360"/>
@@ -5212,7 +5212,7 @@
     <w:p>
       <w:pPr>
         <w:tabs>
-          <w:tab w:val="left" w:leader="none" w:pos="0"/>
+          <w:tab w:val="left" w:leader="none" w:pos="720"/>
           <w:tab w:val="left" w:leader="none" w:pos="720"/>
           <w:tab w:val="left" w:leader="none" w:pos="1440"/>
           <w:tab w:val="left" w:leader="none" w:pos="2160"/>
@@ -5252,7 +5252,7 @@
         </w:pBdr>
         <w:shd w:fill="auto" w:val="clear"/>
         <w:tabs>
-          <w:tab w:val="left" w:leader="none" w:pos="0"/>
+          <w:tab w:val="left" w:leader="none" w:pos="720"/>
           <w:tab w:val="left" w:leader="none" w:pos="2868"/>
           <w:tab w:val="left" w:leader="none" w:pos="7906"/>
           <w:tab w:val="left" w:leader="none" w:pos="8626"/>
@@ -5309,7 +5309,7 @@
     <w:p>
       <w:pPr>
         <w:tabs>
-          <w:tab w:val="left" w:leader="none" w:pos="0"/>
+          <w:tab w:val="left" w:leader="none" w:pos="720"/>
           <w:tab w:val="left" w:leader="none" w:pos="720"/>
           <w:tab w:val="left" w:leader="none" w:pos="1440"/>
           <w:tab w:val="left" w:leader="none" w:pos="2160"/>
@@ -5338,8 +5338,8 @@
       <w:pPr>
         <w:pStyle w:val="Heading3"/>
         <w:tabs>
-          <w:tab w:val="left" w:leader="none" w:pos="0"/>
-          <w:tab w:val="left" w:leader="none" w:pos="0"/>
+          <w:tab w:val="left" w:leader="none" w:pos="720"/>
+          <w:tab w:val="left" w:leader="none" w:pos="720"/>
           <w:tab w:val="left" w:leader="none" w:pos="960"/>
           <w:tab w:val="left" w:leader="none" w:pos="1200"/>
           <w:tab w:val="left" w:leader="none" w:pos="1440"/>
@@ -5477,7 +5477,7 @@
     <w:p>
       <w:pPr>
         <w:tabs>
-          <w:tab w:val="left" w:leader="none" w:pos="0"/>
+          <w:tab w:val="left" w:leader="none" w:pos="720"/>
           <w:tab w:val="left" w:leader="none" w:pos="720"/>
           <w:tab w:val="left" w:leader="none" w:pos="1440"/>
           <w:tab w:val="left" w:leader="none" w:pos="2160"/>
@@ -5579,7 +5579,7 @@
     <w:p>
       <w:pPr>
         <w:tabs>
-          <w:tab w:val="left" w:leader="none" w:pos="0"/>
+          <w:tab w:val="left" w:leader="none" w:pos="720"/>
           <w:tab w:val="left" w:leader="none" w:pos="720"/>
           <w:tab w:val="left" w:leader="none" w:pos="1440"/>
           <w:tab w:val="left" w:leader="none" w:pos="2160"/>
@@ -5608,8 +5608,8 @@
       <w:pPr>
         <w:pStyle w:val="Heading3"/>
         <w:tabs>
-          <w:tab w:val="left" w:leader="none" w:pos="0"/>
-          <w:tab w:val="left" w:leader="none" w:pos="0"/>
+          <w:tab w:val="left" w:leader="none" w:pos="720"/>
+          <w:tab w:val="left" w:leader="none" w:pos="720"/>
           <w:tab w:val="left" w:leader="none" w:pos="1440"/>
           <w:tab w:val="left" w:leader="none" w:pos="5040"/>
           <w:tab w:val="left" w:leader="none" w:pos="5760"/>
@@ -5648,7 +5648,7 @@
     <w:p>
       <w:pPr>
         <w:tabs>
-          <w:tab w:val="left" w:leader="none" w:pos="0"/>
+          <w:tab w:val="left" w:leader="none" w:pos="720"/>
           <w:tab w:val="left" w:leader="none" w:pos="720"/>
           <w:tab w:val="left" w:leader="none" w:pos="1440"/>
           <w:tab w:val="left" w:leader="none" w:pos="2160"/>
@@ -5688,8 +5688,8 @@
         </w:pBdr>
         <w:shd w:fill="auto" w:val="clear"/>
         <w:tabs>
-          <w:tab w:val="left" w:leader="none" w:pos="0"/>
-          <w:tab w:val="left" w:leader="none" w:pos="0"/>
+          <w:tab w:val="left" w:leader="none" w:pos="720"/>
+          <w:tab w:val="left" w:leader="none" w:pos="720"/>
           <w:tab w:val="left" w:leader="none" w:pos="2167"/>
           <w:tab w:val="left" w:leader="none" w:pos="2877"/>
           <w:tab w:val="left" w:leader="none" w:pos="6569"/>
@@ -5749,7 +5749,7 @@
     <w:p>
       <w:pPr>
         <w:tabs>
-          <w:tab w:val="left" w:leader="none" w:pos="0"/>
+          <w:tab w:val="left" w:leader="none" w:pos="720"/>
           <w:tab w:val="left" w:leader="none" w:pos="720"/>
           <w:tab w:val="left" w:leader="none" w:pos="1440"/>
           <w:tab w:val="left" w:leader="none" w:pos="2160"/>
@@ -5789,8 +5789,8 @@
         </w:pBdr>
         <w:shd w:fill="auto" w:val="clear"/>
         <w:tabs>
-          <w:tab w:val="left" w:leader="none" w:pos="0"/>
-          <w:tab w:val="left" w:leader="none" w:pos="0"/>
+          <w:tab w:val="left" w:leader="none" w:pos="720"/>
+          <w:tab w:val="left" w:leader="none" w:pos="720"/>
           <w:tab w:val="left" w:leader="none" w:pos="2139"/>
           <w:tab w:val="left" w:leader="none" w:pos="2857"/>
           <w:tab w:val="left" w:leader="none" w:pos="7925"/>
@@ -5849,7 +5849,7 @@
     <w:p>
       <w:pPr>
         <w:tabs>
-          <w:tab w:val="left" w:leader="none" w:pos="0"/>
+          <w:tab w:val="left" w:leader="none" w:pos="720"/>
           <w:tab w:val="left" w:leader="none" w:pos="720"/>
           <w:tab w:val="left" w:leader="none" w:pos="1440"/>
           <w:tab w:val="left" w:leader="none" w:pos="2160"/>
@@ -5889,8 +5889,8 @@
         </w:pBdr>
         <w:shd w:fill="auto" w:val="clear"/>
         <w:tabs>
-          <w:tab w:val="left" w:leader="none" w:pos="0"/>
-          <w:tab w:val="left" w:leader="none" w:pos="0"/>
+          <w:tab w:val="left" w:leader="none" w:pos="720"/>
+          <w:tab w:val="left" w:leader="none" w:pos="720"/>
           <w:tab w:val="left" w:leader="none" w:pos="2146"/>
           <w:tab w:val="left" w:leader="none" w:pos="2855"/>
           <w:tab w:val="left" w:leader="none" w:pos="5788"/>
@@ -5950,7 +5950,7 @@
     <w:p>
       <w:pPr>
         <w:tabs>
-          <w:tab w:val="left" w:leader="none" w:pos="0"/>
+          <w:tab w:val="left" w:leader="none" w:pos="720"/>
           <w:tab w:val="left" w:leader="none" w:pos="720"/>
           <w:tab w:val="left" w:leader="none" w:pos="1440"/>
           <w:tab w:val="left" w:leader="none" w:pos="2160"/>
@@ -5990,8 +5990,8 @@
         </w:pBdr>
         <w:shd w:fill="auto" w:val="clear"/>
         <w:tabs>
-          <w:tab w:val="left" w:leader="none" w:pos="0"/>
-          <w:tab w:val="left" w:leader="none" w:pos="0"/>
+          <w:tab w:val="left" w:leader="none" w:pos="720"/>
+          <w:tab w:val="left" w:leader="none" w:pos="720"/>
           <w:tab w:val="left" w:leader="none" w:pos="4302"/>
           <w:tab w:val="left" w:leader="none" w:pos="6051"/>
           <w:tab w:val="left" w:leader="none" w:pos="6411"/>
@@ -6049,7 +6049,7 @@
     <w:p>
       <w:pPr>
         <w:tabs>
-          <w:tab w:val="left" w:leader="none" w:pos="0"/>
+          <w:tab w:val="left" w:leader="none" w:pos="720"/>
           <w:tab w:val="left" w:leader="none" w:pos="720"/>
           <w:tab w:val="left" w:leader="none" w:pos="1440"/>
           <w:tab w:val="left" w:leader="none" w:pos="2160"/>
@@ -6089,8 +6089,8 @@
         </w:pBdr>
         <w:shd w:fill="auto" w:val="clear"/>
         <w:tabs>
-          <w:tab w:val="left" w:leader="none" w:pos="0"/>
-          <w:tab w:val="left" w:leader="none" w:pos="0"/>
+          <w:tab w:val="left" w:leader="none" w:pos="720"/>
+          <w:tab w:val="left" w:leader="none" w:pos="720"/>
           <w:tab w:val="left" w:leader="none" w:pos="2139"/>
           <w:tab w:val="left" w:leader="none" w:pos="2860"/>
           <w:tab w:val="left" w:leader="none" w:pos="7289"/>
@@ -6150,7 +6150,7 @@
     <w:p>
       <w:pPr>
         <w:tabs>
-          <w:tab w:val="left" w:leader="none" w:pos="0"/>
+          <w:tab w:val="left" w:leader="none" w:pos="720"/>
           <w:tab w:val="left" w:leader="none" w:pos="720"/>
           <w:tab w:val="left" w:leader="none" w:pos="1440"/>
           <w:tab w:val="left" w:leader="none" w:pos="2160"/>
@@ -6179,8 +6179,8 @@
       <w:pPr>
         <w:pStyle w:val="Heading3"/>
         <w:tabs>
-          <w:tab w:val="left" w:leader="none" w:pos="0"/>
-          <w:tab w:val="left" w:leader="none" w:pos="0"/>
+          <w:tab w:val="left" w:leader="none" w:pos="720"/>
+          <w:tab w:val="left" w:leader="none" w:pos="720"/>
           <w:tab w:val="left" w:leader="none" w:pos="1492"/>
           <w:tab w:val="left" w:leader="none" w:pos="2185"/>
           <w:tab w:val="left" w:leader="none" w:pos="6546"/>
@@ -6225,7 +6225,7 @@
     <w:p>
       <w:pPr>
         <w:tabs>
-          <w:tab w:val="left" w:leader="none" w:pos="0"/>
+          <w:tab w:val="left" w:leader="none" w:pos="720"/>
           <w:tab w:val="left" w:leader="none" w:pos="720"/>
           <w:tab w:val="left" w:leader="none" w:pos="1440"/>
           <w:tab w:val="left" w:leader="none" w:pos="2160"/>
@@ -6265,8 +6265,8 @@
         </w:pBdr>
         <w:shd w:fill="auto" w:val="clear"/>
         <w:tabs>
-          <w:tab w:val="left" w:leader="none" w:pos="0"/>
-          <w:tab w:val="left" w:leader="none" w:pos="0"/>
+          <w:tab w:val="left" w:leader="none" w:pos="720"/>
+          <w:tab w:val="left" w:leader="none" w:pos="720"/>
         </w:tabs>
         <w:spacing w:after="0" w:before="0" w:line="240" w:lineRule="auto"/>
         <w:ind w:left="1445" w:right="0" w:hanging="720"/>
@@ -6313,7 +6313,7 @@
     <w:p>
       <w:pPr>
         <w:tabs>
-          <w:tab w:val="left" w:leader="none" w:pos="0"/>
+          <w:tab w:val="left" w:leader="none" w:pos="720"/>
           <w:tab w:val="left" w:leader="none" w:pos="720"/>
           <w:tab w:val="left" w:leader="none" w:pos="1440"/>
           <w:tab w:val="left" w:leader="none" w:pos="2160"/>
@@ -6353,8 +6353,8 @@
         </w:pBdr>
         <w:shd w:fill="auto" w:val="clear"/>
         <w:tabs>
-          <w:tab w:val="left" w:leader="none" w:pos="0"/>
-          <w:tab w:val="left" w:leader="none" w:pos="0"/>
+          <w:tab w:val="left" w:leader="none" w:pos="720"/>
+          <w:tab w:val="left" w:leader="none" w:pos="720"/>
           <w:tab w:val="left" w:leader="none" w:pos="7186"/>
           <w:tab w:val="left" w:leader="none" w:pos="7906"/>
           <w:tab w:val="left" w:leader="none" w:pos="8626"/>
@@ -6409,7 +6409,7 @@
     <w:p>
       <w:pPr>
         <w:tabs>
-          <w:tab w:val="left" w:leader="none" w:pos="0"/>
+          <w:tab w:val="left" w:leader="none" w:pos="720"/>
           <w:tab w:val="left" w:leader="none" w:pos="720"/>
           <w:tab w:val="left" w:leader="none" w:pos="1440"/>
           <w:tab w:val="left" w:leader="none" w:pos="2160"/>
@@ -6449,7 +6449,7 @@
         </w:pBdr>
         <w:shd w:fill="auto" w:val="clear"/>
         <w:tabs>
-          <w:tab w:val="left" w:leader="none" w:pos="0"/>
+          <w:tab w:val="left" w:leader="none" w:pos="720"/>
           <w:tab w:val="left" w:leader="none" w:pos="2694"/>
           <w:tab w:val="left" w:leader="none" w:pos="8647"/>
           <w:tab w:val="left" w:leader="none" w:pos="9367"/>
@@ -6572,7 +6572,7 @@
         </w:pBdr>
         <w:shd w:fill="auto" w:val="clear"/>
         <w:tabs>
-          <w:tab w:val="left" w:leader="none" w:pos="0"/>
+          <w:tab w:val="left" w:leader="none" w:pos="720"/>
           <w:tab w:val="left" w:leader="none" w:pos="2694"/>
           <w:tab w:val="left" w:leader="none" w:pos="8647"/>
           <w:tab w:val="left" w:leader="none" w:pos="9367"/>
@@ -6641,7 +6641,7 @@
         </w:pBdr>
         <w:shd w:fill="auto" w:val="clear"/>
         <w:tabs>
-          <w:tab w:val="left" w:leader="none" w:pos="0"/>
+          <w:tab w:val="left" w:leader="none" w:pos="720"/>
           <w:tab w:val="left" w:leader="none" w:pos="720"/>
           <w:tab w:val="left" w:leader="none" w:pos="1440"/>
           <w:tab w:val="left" w:leader="none" w:pos="2160"/>
@@ -6683,8 +6683,8 @@
       <w:pPr>
         <w:pStyle w:val="Heading3"/>
         <w:tabs>
-          <w:tab w:val="left" w:leader="none" w:pos="0"/>
-          <w:tab w:val="left" w:leader="none" w:pos="0"/>
+          <w:tab w:val="left" w:leader="none" w:pos="720"/>
+          <w:tab w:val="left" w:leader="none" w:pos="720"/>
           <w:tab w:val="left" w:leader="none" w:pos="1440"/>
           <w:tab w:val="left" w:leader="none" w:pos="7920"/>
           <w:tab w:val="left" w:leader="none" w:pos="8640"/>
@@ -6720,7 +6720,7 @@
     <w:p>
       <w:pPr>
         <w:tabs>
-          <w:tab w:val="left" w:leader="none" w:pos="0"/>
+          <w:tab w:val="left" w:leader="none" w:pos="720"/>
           <w:tab w:val="left" w:leader="none" w:pos="720"/>
           <w:tab w:val="left" w:leader="none" w:pos="1440"/>
           <w:tab w:val="left" w:leader="none" w:pos="2160"/>
@@ -6749,8 +6749,8 @@
       <w:pPr>
         <w:pStyle w:val="Heading3"/>
         <w:tabs>
-          <w:tab w:val="left" w:leader="none" w:pos="0"/>
-          <w:tab w:val="left" w:leader="none" w:pos="0"/>
+          <w:tab w:val="left" w:leader="none" w:pos="720"/>
+          <w:tab w:val="left" w:leader="none" w:pos="720"/>
           <w:tab w:val="left" w:leader="none" w:pos="720"/>
           <w:tab w:val="left" w:leader="none" w:pos="1440"/>
           <w:tab w:val="left" w:leader="none" w:pos="2880"/>
@@ -6787,7 +6787,7 @@
     <w:p>
       <w:pPr>
         <w:tabs>
-          <w:tab w:val="left" w:leader="none" w:pos="0"/>
+          <w:tab w:val="left" w:leader="none" w:pos="720"/>
           <w:tab w:val="left" w:leader="none" w:pos="720"/>
           <w:tab w:val="left" w:leader="none" w:pos="1440"/>
           <w:tab w:val="left" w:leader="none" w:pos="2160"/>
@@ -6827,8 +6827,8 @@
         </w:pBdr>
         <w:shd w:fill="auto" w:val="clear"/>
         <w:tabs>
-          <w:tab w:val="left" w:leader="none" w:pos="0"/>
-          <w:tab w:val="left" w:leader="none" w:pos="0"/>
+          <w:tab w:val="left" w:leader="none" w:pos="720"/>
+          <w:tab w:val="left" w:leader="none" w:pos="720"/>
           <w:tab w:val="left" w:leader="none" w:pos="2160"/>
           <w:tab w:val="left" w:leader="none" w:pos="2520"/>
         </w:tabs>
@@ -6874,7 +6874,7 @@
     <w:p>
       <w:pPr>
         <w:tabs>
-          <w:tab w:val="left" w:leader="none" w:pos="0"/>
+          <w:tab w:val="left" w:leader="none" w:pos="720"/>
           <w:tab w:val="left" w:leader="none" w:pos="720"/>
           <w:tab w:val="left" w:leader="none" w:pos="1440"/>
           <w:tab w:val="left" w:leader="none" w:pos="2160"/>
@@ -6914,8 +6914,8 @@
         </w:pBdr>
         <w:shd w:fill="auto" w:val="clear"/>
         <w:tabs>
-          <w:tab w:val="left" w:leader="none" w:pos="0"/>
-          <w:tab w:val="left" w:leader="none" w:pos="0"/>
+          <w:tab w:val="left" w:leader="none" w:pos="720"/>
+          <w:tab w:val="left" w:leader="none" w:pos="720"/>
           <w:tab w:val="left" w:leader="none" w:pos="1440"/>
           <w:tab w:val="left" w:leader="none" w:pos="2852"/>
           <w:tab w:val="left" w:leader="none" w:pos="5822"/>
@@ -6974,7 +6974,7 @@
     <w:p>
       <w:pPr>
         <w:tabs>
-          <w:tab w:val="left" w:leader="none" w:pos="0"/>
+          <w:tab w:val="left" w:leader="none" w:pos="720"/>
           <w:tab w:val="left" w:leader="none" w:pos="720"/>
           <w:tab w:val="left" w:leader="none" w:pos="1440"/>
           <w:tab w:val="left" w:leader="none" w:pos="2160"/>
@@ -7014,8 +7014,8 @@
         </w:pBdr>
         <w:shd w:fill="auto" w:val="clear"/>
         <w:tabs>
-          <w:tab w:val="left" w:leader="none" w:pos="0"/>
-          <w:tab w:val="left" w:leader="none" w:pos="0"/>
+          <w:tab w:val="left" w:leader="none" w:pos="720"/>
+          <w:tab w:val="left" w:leader="none" w:pos="720"/>
           <w:tab w:val="left" w:leader="none" w:pos="2164"/>
           <w:tab w:val="left" w:leader="none" w:pos="2548"/>
           <w:tab w:val="left" w:leader="none" w:pos="4304"/>
@@ -7087,8 +7087,8 @@
         </w:pBdr>
         <w:shd w:fill="auto" w:val="clear"/>
         <w:tabs>
-          <w:tab w:val="left" w:leader="none" w:pos="0"/>
-          <w:tab w:val="left" w:leader="none" w:pos="0"/>
+          <w:tab w:val="left" w:leader="none" w:pos="720"/>
+          <w:tab w:val="left" w:leader="none" w:pos="720"/>
           <w:tab w:val="left" w:leader="none" w:pos="1260"/>
           <w:tab w:val="left" w:leader="none" w:pos="1440"/>
           <w:tab w:val="left" w:leader="none" w:pos="2160"/>
@@ -7141,8 +7141,8 @@
         </w:pBdr>
         <w:shd w:fill="auto" w:val="clear"/>
         <w:tabs>
-          <w:tab w:val="left" w:leader="none" w:pos="0"/>
-          <w:tab w:val="left" w:leader="none" w:pos="0"/>
+          <w:tab w:val="left" w:leader="none" w:pos="720"/>
+          <w:tab w:val="left" w:leader="none" w:pos="720"/>
           <w:tab w:val="left" w:leader="none" w:pos="1442"/>
           <w:tab w:val="left" w:leader="none" w:pos="2166"/>
           <w:tab w:val="left" w:leader="none" w:pos="3596"/>
@@ -7365,7 +7365,7 @@
     <w:p>
       <w:pPr>
         <w:tabs>
-          <w:tab w:val="left" w:leader="none" w:pos="0"/>
+          <w:tab w:val="left" w:leader="none" w:pos="720"/>
           <w:tab w:val="left" w:leader="none" w:pos="720"/>
           <w:tab w:val="left" w:leader="none" w:pos="1440"/>
           <w:tab w:val="left" w:leader="none" w:pos="2160"/>
@@ -7394,8 +7394,8 @@
       <w:pPr>
         <w:pStyle w:val="Heading3"/>
         <w:tabs>
-          <w:tab w:val="left" w:leader="none" w:pos="0"/>
-          <w:tab w:val="left" w:leader="none" w:pos="0"/>
+          <w:tab w:val="left" w:leader="none" w:pos="720"/>
+          <w:tab w:val="left" w:leader="none" w:pos="720"/>
           <w:tab w:val="left" w:leader="none" w:pos="720"/>
           <w:tab w:val="left" w:leader="none" w:pos="1440"/>
           <w:tab w:val="left" w:leader="none" w:pos="2880"/>
@@ -7446,7 +7446,7 @@
     <w:p>
       <w:pPr>
         <w:tabs>
-          <w:tab w:val="left" w:leader="none" w:pos="0"/>
+          <w:tab w:val="left" w:leader="none" w:pos="720"/>
           <w:tab w:val="left" w:leader="none" w:pos="2866"/>
         </w:tabs>
         <w:ind w:left="2160" w:firstLine="0"/>
@@ -7483,7 +7483,7 @@
     <w:p>
       <w:pPr>
         <w:tabs>
-          <w:tab w:val="left" w:leader="none" w:pos="0"/>
+          <w:tab w:val="left" w:leader="none" w:pos="720"/>
           <w:tab w:val="left" w:leader="none" w:pos="2866"/>
         </w:tabs>
         <w:ind w:left="2160" w:firstLine="0"/>
@@ -7518,7 +7518,7 @@
     <w:p>
       <w:pPr>
         <w:tabs>
-          <w:tab w:val="left" w:leader="none" w:pos="0"/>
+          <w:tab w:val="left" w:leader="none" w:pos="720"/>
           <w:tab w:val="left" w:leader="none" w:pos="2866"/>
         </w:tabs>
         <w:spacing w:before="144" w:lineRule="auto"/>
@@ -7539,7 +7539,7 @@
     <w:p>
       <w:pPr>
         <w:tabs>
-          <w:tab w:val="left" w:leader="none" w:pos="0"/>
+          <w:tab w:val="left" w:leader="none" w:pos="720"/>
           <w:tab w:val="left" w:leader="none" w:pos="2892"/>
         </w:tabs>
         <w:spacing w:before="144" w:lineRule="auto"/>
@@ -7560,7 +7560,7 @@
     <w:p>
       <w:pPr>
         <w:tabs>
-          <w:tab w:val="left" w:leader="none" w:pos="0"/>
+          <w:tab w:val="left" w:leader="none" w:pos="720"/>
           <w:tab w:val="left" w:leader="none" w:pos="2892"/>
         </w:tabs>
         <w:spacing w:before="144" w:lineRule="auto"/>
@@ -7583,7 +7583,7 @@
     <w:p>
       <w:pPr>
         <w:tabs>
-          <w:tab w:val="left" w:leader="none" w:pos="0"/>
+          <w:tab w:val="left" w:leader="none" w:pos="720"/>
           <w:tab w:val="left" w:leader="none" w:pos="720"/>
           <w:tab w:val="left" w:leader="none" w:pos="1440"/>
           <w:tab w:val="left" w:leader="none" w:pos="2160"/>
@@ -7612,8 +7612,8 @@
       <w:pPr>
         <w:pStyle w:val="Heading3"/>
         <w:tabs>
-          <w:tab w:val="left" w:leader="none" w:pos="0"/>
-          <w:tab w:val="left" w:leader="none" w:pos="0"/>
+          <w:tab w:val="left" w:leader="none" w:pos="720"/>
+          <w:tab w:val="left" w:leader="none" w:pos="720"/>
           <w:tab w:val="left" w:leader="none" w:pos="694"/>
           <w:tab w:val="left" w:leader="none" w:pos="720"/>
           <w:tab w:val="left" w:leader="none" w:pos="2880"/>
@@ -7657,7 +7657,7 @@
     <w:p>
       <w:pPr>
         <w:tabs>
-          <w:tab w:val="left" w:leader="none" w:pos="0"/>
+          <w:tab w:val="left" w:leader="none" w:pos="720"/>
           <w:tab w:val="left" w:leader="none" w:pos="720"/>
           <w:tab w:val="left" w:leader="none" w:pos="1440"/>
           <w:tab w:val="left" w:leader="none" w:pos="2160"/>
@@ -7697,8 +7697,8 @@
         </w:pBdr>
         <w:shd w:fill="auto" w:val="clear"/>
         <w:tabs>
-          <w:tab w:val="left" w:leader="none" w:pos="0"/>
-          <w:tab w:val="left" w:leader="none" w:pos="0"/>
+          <w:tab w:val="left" w:leader="none" w:pos="720"/>
+          <w:tab w:val="left" w:leader="none" w:pos="720"/>
         </w:tabs>
         <w:spacing w:after="0" w:before="0" w:line="240" w:lineRule="auto"/>
         <w:ind w:left="2160" w:right="0" w:hanging="720"/>
@@ -7780,7 +7780,7 @@
     <w:p>
       <w:pPr>
         <w:tabs>
-          <w:tab w:val="left" w:leader="none" w:pos="0"/>
+          <w:tab w:val="left" w:leader="none" w:pos="720"/>
           <w:tab w:val="left" w:leader="none" w:pos="720"/>
           <w:tab w:val="left" w:leader="none" w:pos="1440"/>
           <w:tab w:val="left" w:leader="none" w:pos="2160"/>
@@ -7878,7 +7878,7 @@
     <w:p>
       <w:pPr>
         <w:tabs>
-          <w:tab w:val="left" w:leader="none" w:pos="0"/>
+          <w:tab w:val="left" w:leader="none" w:pos="720"/>
           <w:tab w:val="left" w:leader="none" w:pos="720"/>
           <w:tab w:val="left" w:leader="none" w:pos="1440"/>
           <w:tab w:val="left" w:leader="none" w:pos="2160"/>
@@ -7976,7 +7976,7 @@
     <w:p>
       <w:pPr>
         <w:tabs>
-          <w:tab w:val="left" w:leader="none" w:pos="0"/>
+          <w:tab w:val="left" w:leader="none" w:pos="720"/>
           <w:tab w:val="left" w:leader="none" w:pos="720"/>
           <w:tab w:val="left" w:leader="none" w:pos="1440"/>
           <w:tab w:val="left" w:leader="none" w:pos="2160"/>
@@ -8074,7 +8074,7 @@
     <w:p>
       <w:pPr>
         <w:tabs>
-          <w:tab w:val="left" w:leader="none" w:pos="0"/>
+          <w:tab w:val="left" w:leader="none" w:pos="720"/>
           <w:tab w:val="left" w:leader="none" w:pos="720"/>
           <w:tab w:val="left" w:leader="none" w:pos="1440"/>
           <w:tab w:val="left" w:leader="none" w:pos="2160"/>
@@ -8244,7 +8244,7 @@
     <w:p>
       <w:pPr>
         <w:tabs>
-          <w:tab w:val="left" w:leader="none" w:pos="0"/>
+          <w:tab w:val="left" w:leader="none" w:pos="720"/>
           <w:tab w:val="left" w:leader="none" w:pos="720"/>
           <w:tab w:val="left" w:leader="none" w:pos="1440"/>
           <w:tab w:val="left" w:leader="none" w:pos="2160"/>
@@ -8273,8 +8273,8 @@
       <w:pPr>
         <w:pStyle w:val="Heading3"/>
         <w:tabs>
-          <w:tab w:val="left" w:leader="none" w:pos="0"/>
-          <w:tab w:val="left" w:leader="none" w:pos="0"/>
+          <w:tab w:val="left" w:leader="none" w:pos="720"/>
+          <w:tab w:val="left" w:leader="none" w:pos="720"/>
           <w:tab w:val="left" w:leader="none" w:pos="1433"/>
           <w:tab w:val="left" w:leader="none" w:pos="2164"/>
           <w:tab w:val="left" w:leader="none" w:pos="5040"/>
@@ -8320,7 +8320,7 @@
     <w:p>
       <w:pPr>
         <w:tabs>
-          <w:tab w:val="left" w:leader="none" w:pos="0"/>
+          <w:tab w:val="left" w:leader="none" w:pos="720"/>
           <w:tab w:val="left" w:leader="none" w:pos="720"/>
           <w:tab w:val="left" w:leader="none" w:pos="1440"/>
           <w:tab w:val="left" w:leader="none" w:pos="2160"/>
@@ -8447,8 +8447,8 @@
       <w:pPr>
         <w:pStyle w:val="Heading3"/>
         <w:tabs>
-          <w:tab w:val="left" w:leader="none" w:pos="0"/>
-          <w:tab w:val="left" w:leader="none" w:pos="0"/>
+          <w:tab w:val="left" w:leader="none" w:pos="720"/>
+          <w:tab w:val="left" w:leader="none" w:pos="720"/>
           <w:tab w:val="left" w:leader="none" w:pos="1440"/>
           <w:tab w:val="left" w:leader="none" w:pos="2160"/>
           <w:tab w:val="left" w:leader="none" w:pos="4410"/>
@@ -8489,7 +8489,7 @@
     <w:p>
       <w:pPr>
         <w:tabs>
-          <w:tab w:val="left" w:leader="none" w:pos="0"/>
+          <w:tab w:val="left" w:leader="none" w:pos="720"/>
           <w:tab w:val="left" w:leader="none" w:pos="720"/>
           <w:tab w:val="left" w:leader="none" w:pos="1440"/>
           <w:tab w:val="left" w:leader="none" w:pos="2160"/>
@@ -8548,7 +8548,7 @@
     <w:p>
       <w:pPr>
         <w:tabs>
-          <w:tab w:val="left" w:leader="none" w:pos="0"/>
+          <w:tab w:val="left" w:leader="none" w:pos="720"/>
           <w:tab w:val="left" w:leader="none" w:pos="720"/>
           <w:tab w:val="left" w:leader="none" w:pos="1440"/>
           <w:tab w:val="left" w:leader="none" w:pos="2160"/>
@@ -8588,8 +8588,8 @@
         </w:pBdr>
         <w:shd w:fill="auto" w:val="clear"/>
         <w:tabs>
-          <w:tab w:val="left" w:leader="none" w:pos="0"/>
-          <w:tab w:val="left" w:leader="none" w:pos="0"/>
+          <w:tab w:val="left" w:leader="none" w:pos="720"/>
+          <w:tab w:val="left" w:leader="none" w:pos="720"/>
           <w:tab w:val="left" w:leader="none" w:pos="2156"/>
         </w:tabs>
         <w:spacing w:after="0" w:before="0" w:line="240" w:lineRule="auto"/>
@@ -8637,7 +8637,7 @@
     <w:p>
       <w:pPr>
         <w:tabs>
-          <w:tab w:val="left" w:leader="none" w:pos="0"/>
+          <w:tab w:val="left" w:leader="none" w:pos="720"/>
           <w:tab w:val="left" w:leader="none" w:pos="720"/>
           <w:tab w:val="left" w:leader="none" w:pos="1440"/>
           <w:tab w:val="left" w:leader="none" w:pos="2160"/>
@@ -8677,8 +8677,8 @@
         </w:pBdr>
         <w:shd w:fill="auto" w:val="clear"/>
         <w:tabs>
-          <w:tab w:val="left" w:leader="none" w:pos="0"/>
-          <w:tab w:val="left" w:leader="none" w:pos="0"/>
+          <w:tab w:val="left" w:leader="none" w:pos="720"/>
+          <w:tab w:val="left" w:leader="none" w:pos="720"/>
           <w:tab w:val="left" w:leader="none" w:pos="2168"/>
           <w:tab w:val="left" w:leader="none" w:pos="5822"/>
           <w:tab w:val="left" w:leader="none" w:pos="6362"/>
@@ -8737,7 +8737,7 @@
     <w:p>
       <w:pPr>
         <w:tabs>
-          <w:tab w:val="left" w:leader="none" w:pos="0"/>
+          <w:tab w:val="left" w:leader="none" w:pos="720"/>
           <w:tab w:val="left" w:leader="none" w:pos="720"/>
           <w:tab w:val="left" w:leader="none" w:pos="1440"/>
           <w:tab w:val="left" w:leader="none" w:pos="2160"/>
@@ -8777,8 +8777,8 @@
         </w:pBdr>
         <w:shd w:fill="auto" w:val="clear"/>
         <w:tabs>
-          <w:tab w:val="left" w:leader="none" w:pos="0"/>
-          <w:tab w:val="left" w:leader="none" w:pos="0"/>
+          <w:tab w:val="left" w:leader="none" w:pos="720"/>
+          <w:tab w:val="left" w:leader="none" w:pos="720"/>
           <w:tab w:val="left" w:leader="none" w:pos="2165"/>
           <w:tab w:val="left" w:leader="none" w:pos="5148"/>
           <w:tab w:val="left" w:leader="none" w:pos="5598"/>
@@ -8849,8 +8849,8 @@
         </w:pBdr>
         <w:shd w:fill="auto" w:val="clear"/>
         <w:tabs>
-          <w:tab w:val="left" w:leader="none" w:pos="0"/>
-          <w:tab w:val="left" w:leader="none" w:pos="0"/>
+          <w:tab w:val="left" w:leader="none" w:pos="720"/>
+          <w:tab w:val="left" w:leader="none" w:pos="720"/>
           <w:tab w:val="left" w:leader="none" w:pos="2165"/>
           <w:tab w:val="left" w:leader="none" w:pos="5148"/>
           <w:tab w:val="left" w:leader="none" w:pos="5598"/>
@@ -8906,7 +8906,7 @@
     <w:p>
       <w:pPr>
         <w:tabs>
-          <w:tab w:val="left" w:leader="none" w:pos="0"/>
+          <w:tab w:val="left" w:leader="none" w:pos="720"/>
           <w:tab w:val="left" w:leader="none" w:pos="720"/>
           <w:tab w:val="left" w:leader="none" w:pos="1440"/>
           <w:tab w:val="left" w:leader="none" w:pos="2160"/>
@@ -8935,8 +8935,8 @@
       <w:pPr>
         <w:pStyle w:val="Heading3"/>
         <w:tabs>
-          <w:tab w:val="left" w:leader="none" w:pos="0"/>
-          <w:tab w:val="left" w:leader="none" w:pos="0"/>
+          <w:tab w:val="left" w:leader="none" w:pos="720"/>
+          <w:tab w:val="left" w:leader="none" w:pos="720"/>
           <w:tab w:val="left" w:leader="none" w:pos="1440"/>
           <w:tab w:val="left" w:leader="none" w:pos="5040"/>
           <w:tab w:val="left" w:leader="none" w:pos="5760"/>
@@ -8977,7 +8977,7 @@
     <w:p>
       <w:pPr>
         <w:tabs>
-          <w:tab w:val="left" w:leader="none" w:pos="0"/>
+          <w:tab w:val="left" w:leader="none" w:pos="720"/>
           <w:tab w:val="left" w:leader="none" w:pos="720"/>
           <w:tab w:val="left" w:leader="none" w:pos="1440"/>
           <w:tab w:val="left" w:leader="none" w:pos="2160"/>
@@ -9017,8 +9017,8 @@
         </w:pBdr>
         <w:shd w:fill="auto" w:val="clear"/>
         <w:tabs>
-          <w:tab w:val="left" w:leader="none" w:pos="0"/>
-          <w:tab w:val="left" w:leader="none" w:pos="0"/>
+          <w:tab w:val="left" w:leader="none" w:pos="720"/>
+          <w:tab w:val="left" w:leader="none" w:pos="720"/>
           <w:tab w:val="left" w:leader="none" w:pos="90"/>
           <w:tab w:val="left" w:leader="none" w:pos="2160"/>
           <w:tab w:val="left" w:leader="none" w:pos="7650"/>
@@ -9076,7 +9076,7 @@
     <w:p>
       <w:pPr>
         <w:tabs>
-          <w:tab w:val="left" w:leader="none" w:pos="0"/>
+          <w:tab w:val="left" w:leader="none" w:pos="720"/>
           <w:tab w:val="left" w:leader="none" w:pos="720"/>
           <w:tab w:val="left" w:leader="none" w:pos="1440"/>
           <w:tab w:val="left" w:leader="none" w:pos="2160"/>
@@ -9116,8 +9116,8 @@
         </w:pBdr>
         <w:shd w:fill="auto" w:val="clear"/>
         <w:tabs>
-          <w:tab w:val="left" w:leader="none" w:pos="0"/>
-          <w:tab w:val="left" w:leader="none" w:pos="0"/>
+          <w:tab w:val="left" w:leader="none" w:pos="720"/>
+          <w:tab w:val="left" w:leader="none" w:pos="720"/>
           <w:tab w:val="left" w:leader="none" w:pos="90"/>
           <w:tab w:val="left" w:leader="none" w:pos="2160"/>
           <w:tab w:val="left" w:leader="none" w:pos="7200"/>
@@ -9174,7 +9174,7 @@
     <w:p>
       <w:pPr>
         <w:tabs>
-          <w:tab w:val="left" w:leader="none" w:pos="0"/>
+          <w:tab w:val="left" w:leader="none" w:pos="720"/>
           <w:tab w:val="left" w:leader="none" w:pos="720"/>
           <w:tab w:val="left" w:leader="none" w:pos="1440"/>
           <w:tab w:val="left" w:leader="none" w:pos="2160"/>
@@ -9214,8 +9214,8 @@
         </w:pBdr>
         <w:shd w:fill="auto" w:val="clear"/>
         <w:tabs>
-          <w:tab w:val="left" w:leader="none" w:pos="0"/>
-          <w:tab w:val="left" w:leader="none" w:pos="0"/>
+          <w:tab w:val="left" w:leader="none" w:pos="720"/>
+          <w:tab w:val="left" w:leader="none" w:pos="720"/>
           <w:tab w:val="left" w:leader="none" w:pos="90"/>
           <w:tab w:val="left" w:leader="none" w:pos="2160"/>
           <w:tab w:val="left" w:leader="none" w:pos="6840"/>
@@ -9275,7 +9275,7 @@
     <w:p>
       <w:pPr>
         <w:tabs>
-          <w:tab w:val="left" w:leader="none" w:pos="0"/>
+          <w:tab w:val="left" w:leader="none" w:pos="720"/>
           <w:tab w:val="left" w:leader="none" w:pos="720"/>
           <w:tab w:val="left" w:leader="none" w:pos="1440"/>
           <w:tab w:val="left" w:leader="none" w:pos="2160"/>
@@ -9315,8 +9315,8 @@
         </w:pBdr>
         <w:shd w:fill="auto" w:val="clear"/>
         <w:tabs>
-          <w:tab w:val="left" w:leader="none" w:pos="0"/>
-          <w:tab w:val="left" w:leader="none" w:pos="0"/>
+          <w:tab w:val="left" w:leader="none" w:pos="720"/>
+          <w:tab w:val="left" w:leader="none" w:pos="720"/>
           <w:tab w:val="left" w:leader="none" w:pos="90"/>
           <w:tab w:val="left" w:leader="none" w:pos="2160"/>
           <w:tab w:val="left" w:leader="none" w:pos="7200"/>
@@ -9414,8 +9414,8 @@
         </w:pBdr>
         <w:shd w:fill="auto" w:val="clear"/>
         <w:tabs>
-          <w:tab w:val="left" w:leader="none" w:pos="0"/>
-          <w:tab w:val="left" w:leader="none" w:pos="0"/>
+          <w:tab w:val="left" w:leader="none" w:pos="720"/>
+          <w:tab w:val="left" w:leader="none" w:pos="720"/>
           <w:tab w:val="left" w:leader="none" w:pos="90"/>
           <w:tab w:val="left" w:leader="none" w:pos="2160"/>
           <w:tab w:val="left" w:leader="none" w:pos="7200"/>
@@ -9512,8 +9512,8 @@
         </w:pBdr>
         <w:shd w:fill="auto" w:val="clear"/>
         <w:tabs>
-          <w:tab w:val="left" w:leader="none" w:pos="0"/>
-          <w:tab w:val="left" w:leader="none" w:pos="0"/>
+          <w:tab w:val="left" w:leader="none" w:pos="720"/>
+          <w:tab w:val="left" w:leader="none" w:pos="720"/>
           <w:tab w:val="left" w:leader="none" w:pos="90"/>
           <w:tab w:val="left" w:leader="none" w:pos="2160"/>
           <w:tab w:val="left" w:leader="none" w:pos="6480"/>
@@ -9611,8 +9611,8 @@
         </w:pBdr>
         <w:shd w:fill="auto" w:val="clear"/>
         <w:tabs>
-          <w:tab w:val="left" w:leader="none" w:pos="0"/>
-          <w:tab w:val="left" w:leader="none" w:pos="0"/>
+          <w:tab w:val="left" w:leader="none" w:pos="720"/>
+          <w:tab w:val="left" w:leader="none" w:pos="720"/>
           <w:tab w:val="left" w:leader="none" w:pos="90"/>
           <w:tab w:val="left" w:leader="none" w:pos="2160"/>
           <w:tab w:val="left" w:leader="none" w:pos="6480"/>
@@ -9670,7 +9670,7 @@
     <w:p>
       <w:pPr>
         <w:tabs>
-          <w:tab w:val="left" w:leader="none" w:pos="0"/>
+          <w:tab w:val="left" w:leader="none" w:pos="720"/>
           <w:tab w:val="left" w:leader="none" w:pos="720"/>
           <w:tab w:val="left" w:leader="none" w:pos="1440"/>
           <w:tab w:val="left" w:leader="none" w:pos="2160"/>
@@ -9699,8 +9699,8 @@
       <w:pPr>
         <w:pStyle w:val="Heading3"/>
         <w:tabs>
-          <w:tab w:val="left" w:leader="none" w:pos="0"/>
-          <w:tab w:val="left" w:leader="none" w:pos="0"/>
+          <w:tab w:val="left" w:leader="none" w:pos="720"/>
+          <w:tab w:val="left" w:leader="none" w:pos="720"/>
           <w:tab w:val="left" w:leader="none" w:pos="720"/>
           <w:tab w:val="left" w:leader="none" w:pos="1440"/>
           <w:tab w:val="left" w:leader="none" w:pos="2880"/>
@@ -9737,7 +9737,7 @@
     <w:p>
       <w:pPr>
         <w:tabs>
-          <w:tab w:val="left" w:leader="none" w:pos="0"/>
+          <w:tab w:val="left" w:leader="none" w:pos="720"/>
           <w:tab w:val="left" w:leader="none" w:pos="720"/>
           <w:tab w:val="left" w:leader="none" w:pos="1440"/>
           <w:tab w:val="left" w:leader="none" w:pos="2160"/>
@@ -9777,8 +9777,8 @@
         </w:pBdr>
         <w:shd w:fill="auto" w:val="clear"/>
         <w:tabs>
-          <w:tab w:val="left" w:leader="none" w:pos="0"/>
-          <w:tab w:val="left" w:leader="none" w:pos="0"/>
+          <w:tab w:val="left" w:leader="none" w:pos="720"/>
+          <w:tab w:val="left" w:leader="none" w:pos="720"/>
           <w:tab w:val="left" w:leader="none" w:pos="5040"/>
           <w:tab w:val="left" w:leader="none" w:pos="5490"/>
           <w:tab w:val="left" w:leader="none" w:pos="6480"/>
@@ -9833,7 +9833,7 @@
     <w:p>
       <w:pPr>
         <w:tabs>
-          <w:tab w:val="left" w:leader="none" w:pos="0"/>
+          <w:tab w:val="left" w:leader="none" w:pos="720"/>
           <w:tab w:val="left" w:leader="none" w:pos="720"/>
           <w:tab w:val="left" w:leader="none" w:pos="1440"/>
           <w:tab w:val="left" w:leader="none" w:pos="2160"/>
@@ -9862,8 +9862,8 @@
       <w:pPr>
         <w:pStyle w:val="Heading3"/>
         <w:tabs>
-          <w:tab w:val="left" w:leader="none" w:pos="0"/>
-          <w:tab w:val="left" w:leader="none" w:pos="0"/>
+          <w:tab w:val="left" w:leader="none" w:pos="720"/>
+          <w:tab w:val="left" w:leader="none" w:pos="720"/>
           <w:tab w:val="left" w:leader="none" w:pos="1440"/>
           <w:tab w:val="left" w:leader="none" w:pos="2880"/>
           <w:tab w:val="left" w:leader="none" w:pos="3600"/>
@@ -10099,7 +10099,7 @@
     <w:p>
       <w:pPr>
         <w:tabs>
-          <w:tab w:val="left" w:leader="none" w:pos="0"/>
+          <w:tab w:val="left" w:leader="none" w:pos="720"/>
           <w:tab w:val="left" w:leader="none" w:pos="720"/>
           <w:tab w:val="left" w:leader="none" w:pos="1440"/>
           <w:tab w:val="left" w:leader="none" w:pos="2160"/>
@@ -10517,7 +10517,7 @@
     <w:p>
       <w:pPr>
         <w:tabs>
-          <w:tab w:val="left" w:leader="none" w:pos="0"/>
+          <w:tab w:val="left" w:leader="none" w:pos="720"/>
           <w:tab w:val="left" w:leader="none" w:pos="720"/>
           <w:tab w:val="left" w:leader="none" w:pos="1440"/>
           <w:tab w:val="left" w:leader="none" w:pos="2160"/>
@@ -10546,8 +10546,8 @@
       <w:pPr>
         <w:pStyle w:val="Heading3"/>
         <w:tabs>
-          <w:tab w:val="left" w:leader="none" w:pos="0"/>
-          <w:tab w:val="left" w:leader="none" w:pos="0"/>
+          <w:tab w:val="left" w:leader="none" w:pos="720"/>
+          <w:tab w:val="left" w:leader="none" w:pos="720"/>
           <w:tab w:val="left" w:leader="none" w:pos="1440"/>
           <w:tab w:val="left" w:leader="none" w:pos="4770"/>
           <w:tab w:val="left" w:leader="none" w:pos="6480"/>
@@ -10585,7 +10585,7 @@
     <w:p>
       <w:pPr>
         <w:tabs>
-          <w:tab w:val="left" w:leader="none" w:pos="0"/>
+          <w:tab w:val="left" w:leader="none" w:pos="720"/>
           <w:tab w:val="left" w:leader="none" w:pos="720"/>
           <w:tab w:val="left" w:leader="none" w:pos="1440"/>
           <w:tab w:val="left" w:leader="none" w:pos="2160"/>
@@ -10625,8 +10625,8 @@
         </w:pBdr>
         <w:shd w:fill="auto" w:val="clear"/>
         <w:tabs>
-          <w:tab w:val="left" w:leader="none" w:pos="0"/>
-          <w:tab w:val="left" w:leader="none" w:pos="0"/>
+          <w:tab w:val="left" w:leader="none" w:pos="720"/>
+          <w:tab w:val="left" w:leader="none" w:pos="720"/>
           <w:tab w:val="left" w:leader="none" w:pos="2160"/>
           <w:tab w:val="left" w:leader="none" w:pos="7560"/>
           <w:tab w:val="left" w:leader="none" w:pos="7932"/>
@@ -10700,7 +10700,7 @@
     <w:p>
       <w:pPr>
         <w:tabs>
-          <w:tab w:val="left" w:leader="none" w:pos="0"/>
+          <w:tab w:val="left" w:leader="none" w:pos="720"/>
           <w:tab w:val="left" w:leader="none" w:pos="720"/>
           <w:tab w:val="left" w:leader="none" w:pos="1440"/>
           <w:tab w:val="left" w:leader="none" w:pos="2160"/>
@@ -10729,8 +10729,8 @@
       <w:pPr>
         <w:pStyle w:val="Heading3"/>
         <w:tabs>
-          <w:tab w:val="left" w:leader="none" w:pos="0"/>
-          <w:tab w:val="left" w:leader="none" w:pos="0"/>
+          <w:tab w:val="left" w:leader="none" w:pos="720"/>
+          <w:tab w:val="left" w:leader="none" w:pos="720"/>
           <w:tab w:val="left" w:leader="none" w:pos="1440"/>
           <w:tab w:val="left" w:leader="none" w:pos="2195"/>
           <w:tab w:val="left" w:leader="none" w:pos="5756"/>
@@ -10776,7 +10776,7 @@
     <w:p>
       <w:pPr>
         <w:tabs>
-          <w:tab w:val="left" w:leader="none" w:pos="0"/>
+          <w:tab w:val="left" w:leader="none" w:pos="720"/>
           <w:tab w:val="left" w:leader="none" w:pos="720"/>
           <w:tab w:val="left" w:leader="none" w:pos="1440"/>
           <w:tab w:val="left" w:leader="none" w:pos="2160"/>
@@ -10805,8 +10805,8 @@
       <w:pPr>
         <w:pStyle w:val="Heading3"/>
         <w:tabs>
-          <w:tab w:val="left" w:leader="none" w:pos="0"/>
-          <w:tab w:val="left" w:leader="none" w:pos="0"/>
+          <w:tab w:val="left" w:leader="none" w:pos="720"/>
+          <w:tab w:val="left" w:leader="none" w:pos="720"/>
           <w:tab w:val="left" w:leader="none" w:pos="1440"/>
           <w:tab w:val="left" w:leader="none" w:pos="2125"/>
           <w:tab w:val="left" w:leader="none" w:pos="7938"/>
@@ -10849,7 +10849,7 @@
     <w:p>
       <w:pPr>
         <w:tabs>
-          <w:tab w:val="left" w:leader="none" w:pos="0"/>
+          <w:tab w:val="left" w:leader="none" w:pos="720"/>
           <w:tab w:val="left" w:leader="none" w:pos="720"/>
           <w:tab w:val="left" w:leader="none" w:pos="1440"/>
           <w:tab w:val="left" w:leader="none" w:pos="2160"/>
@@ -10878,8 +10878,8 @@
       <w:pPr>
         <w:pStyle w:val="Heading3"/>
         <w:tabs>
-          <w:tab w:val="left" w:leader="none" w:pos="0"/>
-          <w:tab w:val="left" w:leader="none" w:pos="0"/>
+          <w:tab w:val="left" w:leader="none" w:pos="720"/>
+          <w:tab w:val="left" w:leader="none" w:pos="720"/>
           <w:tab w:val="left" w:leader="none" w:pos="1440"/>
           <w:tab w:val="left" w:leader="none" w:pos="5040"/>
           <w:tab w:val="left" w:leader="none" w:pos="5760"/>
@@ -11040,7 +11040,7 @@
     <w:p>
       <w:pPr>
         <w:tabs>
-          <w:tab w:val="left" w:leader="none" w:pos="0"/>
+          <w:tab w:val="left" w:leader="none" w:pos="720"/>
           <w:tab w:val="left" w:leader="none" w:pos="720"/>
           <w:tab w:val="left" w:leader="none" w:pos="1440"/>
           <w:tab w:val="left" w:leader="none" w:pos="2160"/>
@@ -11142,7 +11142,7 @@
     <w:p>
       <w:pPr>
         <w:tabs>
-          <w:tab w:val="left" w:leader="none" w:pos="0"/>
+          <w:tab w:val="left" w:leader="none" w:pos="720"/>
           <w:tab w:val="left" w:leader="none" w:pos="720"/>
           <w:tab w:val="left" w:leader="none" w:pos="1440"/>
           <w:tab w:val="left" w:leader="none" w:pos="2160"/>
@@ -11171,8 +11171,8 @@
       <w:pPr>
         <w:pStyle w:val="Heading3"/>
         <w:tabs>
-          <w:tab w:val="left" w:leader="none" w:pos="0"/>
-          <w:tab w:val="left" w:leader="none" w:pos="0"/>
+          <w:tab w:val="left" w:leader="none" w:pos="720"/>
+          <w:tab w:val="left" w:leader="none" w:pos="720"/>
           <w:tab w:val="left" w:leader="none" w:pos="2880"/>
           <w:tab w:val="left" w:leader="none" w:pos="3600"/>
           <w:tab w:val="left" w:leader="none" w:pos="5040"/>
@@ -11240,7 +11240,7 @@
     <w:p>
       <w:pPr>
         <w:tabs>
-          <w:tab w:val="left" w:leader="none" w:pos="0"/>
+          <w:tab w:val="left" w:leader="none" w:pos="720"/>
           <w:tab w:val="left" w:leader="none" w:pos="720"/>
           <w:tab w:val="left" w:leader="none" w:pos="1440"/>
           <w:tab w:val="left" w:leader="none" w:pos="2160"/>
@@ -11342,7 +11342,7 @@
     <w:p>
       <w:pPr>
         <w:tabs>
-          <w:tab w:val="left" w:leader="none" w:pos="0"/>
+          <w:tab w:val="left" w:leader="none" w:pos="720"/>
           <w:tab w:val="left" w:leader="none" w:pos="720"/>
           <w:tab w:val="left" w:leader="none" w:pos="1440"/>
           <w:tab w:val="left" w:leader="none" w:pos="2160"/>
@@ -11371,8 +11371,8 @@
       <w:pPr>
         <w:pStyle w:val="Heading3"/>
         <w:tabs>
-          <w:tab w:val="left" w:leader="none" w:pos="0"/>
-          <w:tab w:val="left" w:leader="none" w:pos="0"/>
+          <w:tab w:val="left" w:leader="none" w:pos="720"/>
+          <w:tab w:val="left" w:leader="none" w:pos="720"/>
           <w:tab w:val="left" w:leader="none" w:pos="960"/>
           <w:tab w:val="left" w:leader="none" w:pos="1440"/>
           <w:tab w:val="left" w:leader="none" w:pos="1471"/>
@@ -11423,8 +11423,8 @@
       <w:pPr>
         <w:pStyle w:val="Heading3"/>
         <w:tabs>
-          <w:tab w:val="left" w:leader="none" w:pos="0"/>
-          <w:tab w:val="left" w:leader="none" w:pos="0"/>
+          <w:tab w:val="left" w:leader="none" w:pos="720"/>
+          <w:tab w:val="left" w:leader="none" w:pos="720"/>
           <w:tab w:val="left" w:leader="none" w:pos="2160"/>
           <w:tab w:val="left" w:leader="none" w:pos="2400"/>
           <w:tab w:val="left" w:leader="none" w:pos="3589"/>
@@ -11525,7 +11525,7 @@
     <w:p>
       <w:pPr>
         <w:tabs>
-          <w:tab w:val="left" w:leader="none" w:pos="0"/>
+          <w:tab w:val="left" w:leader="none" w:pos="720"/>
         </w:tabs>
         <w:ind w:left="2569" w:firstLine="0"/>
         <w:jc w:val="both"/>
@@ -11563,8 +11563,8 @@
       <w:pPr>
         <w:pStyle w:val="Heading3"/>
         <w:tabs>
-          <w:tab w:val="left" w:leader="none" w:pos="0"/>
-          <w:tab w:val="left" w:leader="none" w:pos="0"/>
+          <w:tab w:val="left" w:leader="none" w:pos="720"/>
+          <w:tab w:val="left" w:leader="none" w:pos="720"/>
           <w:tab w:val="left" w:leader="none" w:pos="2160"/>
           <w:tab w:val="left" w:leader="none" w:pos="3600"/>
           <w:tab w:val="left" w:leader="none" w:pos="6840"/>
@@ -12172,7 +12172,7 @@
     <w:p>
       <w:pPr>
         <w:tabs>
-          <w:tab w:val="left" w:leader="none" w:pos="0"/>
+          <w:tab w:val="left" w:leader="none" w:pos="720"/>
           <w:tab w:val="left" w:leader="none" w:pos="720"/>
           <w:tab w:val="left" w:leader="none" w:pos="1440"/>
           <w:tab w:val="left" w:leader="none" w:pos="2160"/>
@@ -12201,8 +12201,8 @@
       <w:pPr>
         <w:pStyle w:val="Heading3"/>
         <w:tabs>
-          <w:tab w:val="left" w:leader="none" w:pos="0"/>
-          <w:tab w:val="left" w:leader="none" w:pos="0"/>
+          <w:tab w:val="left" w:leader="none" w:pos="720"/>
+          <w:tab w:val="left" w:leader="none" w:pos="720"/>
           <w:tab w:val="left" w:leader="none" w:pos="1440"/>
           <w:tab w:val="left" w:leader="none" w:pos="2160"/>
           <w:tab w:val="left" w:leader="none" w:pos="4410"/>
@@ -12249,7 +12249,7 @@
     <w:p>
       <w:pPr>
         <w:tabs>
-          <w:tab w:val="left" w:leader="none" w:pos="0"/>
+          <w:tab w:val="left" w:leader="none" w:pos="720"/>
           <w:tab w:val="left" w:leader="none" w:pos="720"/>
           <w:tab w:val="left" w:leader="none" w:pos="1440"/>
           <w:tab w:val="left" w:leader="none" w:pos="2160"/>
@@ -12289,8 +12289,8 @@
         </w:pBdr>
         <w:shd w:fill="auto" w:val="clear"/>
         <w:tabs>
-          <w:tab w:val="left" w:leader="none" w:pos="0"/>
-          <w:tab w:val="left" w:leader="none" w:pos="0"/>
+          <w:tab w:val="left" w:leader="none" w:pos="720"/>
+          <w:tab w:val="left" w:leader="none" w:pos="720"/>
           <w:tab w:val="left" w:leader="none" w:pos="2160"/>
           <w:tab w:val="left" w:leader="none" w:pos="4500"/>
           <w:tab w:val="left" w:leader="none" w:pos="7200"/>
@@ -12448,8 +12448,8 @@
         </w:pBdr>
         <w:shd w:fill="auto" w:val="clear"/>
         <w:tabs>
-          <w:tab w:val="left" w:leader="none" w:pos="0"/>
-          <w:tab w:val="left" w:leader="none" w:pos="0"/>
+          <w:tab w:val="left" w:leader="none" w:pos="720"/>
+          <w:tab w:val="left" w:leader="none" w:pos="720"/>
           <w:tab w:val="left" w:leader="none" w:pos="2160"/>
           <w:tab w:val="left" w:leader="none" w:pos="7200"/>
           <w:tab w:val="left" w:leader="none" w:pos="8010"/>
@@ -12537,8 +12537,8 @@
         </w:pBdr>
         <w:shd w:fill="auto" w:val="clear"/>
         <w:tabs>
-          <w:tab w:val="left" w:leader="none" w:pos="0"/>
-          <w:tab w:val="left" w:leader="none" w:pos="0"/>
+          <w:tab w:val="left" w:leader="none" w:pos="720"/>
+          <w:tab w:val="left" w:leader="none" w:pos="720"/>
           <w:tab w:val="left" w:leader="none" w:pos="270"/>
           <w:tab w:val="left" w:leader="none" w:pos="720"/>
           <w:tab w:val="left" w:leader="none" w:pos="1530"/>
@@ -12593,8 +12593,8 @@
         </w:pBdr>
         <w:shd w:fill="auto" w:val="clear"/>
         <w:tabs>
-          <w:tab w:val="left" w:leader="none" w:pos="0"/>
-          <w:tab w:val="left" w:leader="none" w:pos="0"/>
+          <w:tab w:val="left" w:leader="none" w:pos="720"/>
+          <w:tab w:val="left" w:leader="none" w:pos="720"/>
           <w:tab w:val="left" w:leader="none" w:pos="2160"/>
           <w:tab w:val="left" w:leader="none" w:pos="7200"/>
           <w:tab w:val="left" w:leader="none" w:pos="8010"/>
@@ -12711,8 +12711,8 @@
         </w:pBdr>
         <w:shd w:fill="auto" w:val="clear"/>
         <w:tabs>
-          <w:tab w:val="left" w:leader="none" w:pos="0"/>
-          <w:tab w:val="left" w:leader="none" w:pos="0"/>
+          <w:tab w:val="left" w:leader="none" w:pos="720"/>
+          <w:tab w:val="left" w:leader="none" w:pos="720"/>
           <w:tab w:val="left" w:leader="none" w:pos="2160"/>
           <w:tab w:val="left" w:leader="none" w:pos="7200"/>
           <w:tab w:val="left" w:leader="none" w:pos="8010"/>
@@ -12800,8 +12800,8 @@
         </w:pBdr>
         <w:shd w:fill="auto" w:val="clear"/>
         <w:tabs>
-          <w:tab w:val="left" w:leader="none" w:pos="0"/>
-          <w:tab w:val="left" w:leader="none" w:pos="0"/>
+          <w:tab w:val="left" w:leader="none" w:pos="720"/>
+          <w:tab w:val="left" w:leader="none" w:pos="720"/>
           <w:tab w:val="left" w:leader="none" w:pos="2160"/>
           <w:tab w:val="left" w:leader="none" w:pos="7200"/>
           <w:tab w:val="left" w:leader="none" w:pos="8010"/>
@@ -12856,8 +12856,8 @@
         </w:pBdr>
         <w:shd w:fill="auto" w:val="clear"/>
         <w:tabs>
-          <w:tab w:val="left" w:leader="none" w:pos="0"/>
-          <w:tab w:val="left" w:leader="none" w:pos="0"/>
+          <w:tab w:val="left" w:leader="none" w:pos="720"/>
+          <w:tab w:val="left" w:leader="none" w:pos="720"/>
           <w:tab w:val="left" w:leader="none" w:pos="2160"/>
           <w:tab w:val="left" w:leader="none" w:pos="2880"/>
           <w:tab w:val="left" w:leader="none" w:pos="7200"/>
@@ -12927,8 +12927,8 @@
         </w:pBdr>
         <w:shd w:fill="auto" w:val="clear"/>
         <w:tabs>
-          <w:tab w:val="left" w:leader="none" w:pos="0"/>
-          <w:tab w:val="left" w:leader="none" w:pos="0"/>
+          <w:tab w:val="left" w:leader="none" w:pos="720"/>
+          <w:tab w:val="left" w:leader="none" w:pos="720"/>
           <w:tab w:val="left" w:leader="none" w:pos="2160"/>
           <w:tab w:val="left" w:leader="none" w:pos="7200"/>
           <w:tab w:val="left" w:leader="none" w:pos="8010"/>
@@ -12983,8 +12983,8 @@
         </w:pBdr>
         <w:shd w:fill="auto" w:val="clear"/>
         <w:tabs>
-          <w:tab w:val="left" w:leader="none" w:pos="0"/>
-          <w:tab w:val="left" w:leader="none" w:pos="0"/>
+          <w:tab w:val="left" w:leader="none" w:pos="720"/>
+          <w:tab w:val="left" w:leader="none" w:pos="720"/>
           <w:tab w:val="left" w:leader="none" w:pos="2160"/>
           <w:tab w:val="left" w:leader="none" w:pos="2880"/>
           <w:tab w:val="left" w:leader="none" w:pos="7200"/>
@@ -13072,8 +13072,8 @@
       <w:pPr>
         <w:pStyle w:val="Heading3"/>
         <w:tabs>
-          <w:tab w:val="left" w:leader="none" w:pos="0"/>
-          <w:tab w:val="left" w:leader="none" w:pos="0"/>
+          <w:tab w:val="left" w:leader="none" w:pos="720"/>
+          <w:tab w:val="left" w:leader="none" w:pos="720"/>
           <w:tab w:val="left" w:leader="none" w:pos="1440"/>
           <w:tab w:val="left" w:leader="none" w:pos="2160"/>
         </w:tabs>
@@ -13119,7 +13119,7 @@
     <w:p>
       <w:pPr>
         <w:tabs>
-          <w:tab w:val="left" w:leader="none" w:pos="0"/>
+          <w:tab w:val="left" w:leader="none" w:pos="720"/>
           <w:tab w:val="left" w:leader="none" w:pos="720"/>
           <w:tab w:val="left" w:leader="none" w:pos="1440"/>
           <w:tab w:val="left" w:leader="none" w:pos="2160"/>
@@ -13148,8 +13148,8 @@
       <w:pPr>
         <w:pStyle w:val="Heading3"/>
         <w:tabs>
-          <w:tab w:val="left" w:leader="none" w:pos="0"/>
-          <w:tab w:val="left" w:leader="none" w:pos="0"/>
+          <w:tab w:val="left" w:leader="none" w:pos="720"/>
+          <w:tab w:val="left" w:leader="none" w:pos="720"/>
           <w:tab w:val="left" w:leader="none" w:pos="1440"/>
           <w:tab w:val="left" w:leader="none" w:pos="2160"/>
           <w:tab w:val="left" w:leader="none" w:pos="5040"/>
@@ -13223,7 +13223,7 @@
     <w:p>
       <w:pPr>
         <w:tabs>
-          <w:tab w:val="left" w:leader="none" w:pos="0"/>
+          <w:tab w:val="left" w:leader="none" w:pos="720"/>
           <w:tab w:val="left" w:leader="none" w:pos="720"/>
           <w:tab w:val="left" w:leader="none" w:pos="1440"/>
           <w:tab w:val="left" w:leader="none" w:pos="2160"/>
@@ -13325,7 +13325,7 @@
     <w:p>
       <w:pPr>
         <w:tabs>
-          <w:tab w:val="left" w:leader="none" w:pos="0"/>
+          <w:tab w:val="left" w:leader="none" w:pos="720"/>
           <w:tab w:val="left" w:leader="none" w:pos="720"/>
           <w:tab w:val="left" w:leader="none" w:pos="1440"/>
           <w:tab w:val="left" w:leader="none" w:pos="2160"/>
@@ -13354,8 +13354,8 @@
       <w:pPr>
         <w:pStyle w:val="Heading3"/>
         <w:tabs>
-          <w:tab w:val="left" w:leader="none" w:pos="0"/>
-          <w:tab w:val="left" w:leader="none" w:pos="0"/>
+          <w:tab w:val="left" w:leader="none" w:pos="720"/>
+          <w:tab w:val="left" w:leader="none" w:pos="720"/>
         </w:tabs>
         <w:ind w:left="727" w:hanging="720"/>
         <w:jc w:val="both"/>
@@ -13522,7 +13522,7 @@
     <w:p>
       <w:pPr>
         <w:tabs>
-          <w:tab w:val="left" w:leader="none" w:pos="0"/>
+          <w:tab w:val="left" w:leader="none" w:pos="720"/>
           <w:tab w:val="left" w:leader="none" w:pos="720"/>
           <w:tab w:val="left" w:leader="none" w:pos="1440"/>
           <w:tab w:val="left" w:leader="none" w:pos="2160"/>
@@ -13562,8 +13562,8 @@
         </w:pBdr>
         <w:shd w:fill="auto" w:val="clear"/>
         <w:tabs>
-          <w:tab w:val="left" w:leader="none" w:pos="0"/>
-          <w:tab w:val="left" w:leader="none" w:pos="0"/>
+          <w:tab w:val="left" w:leader="none" w:pos="720"/>
+          <w:tab w:val="left" w:leader="none" w:pos="720"/>
         </w:tabs>
         <w:spacing w:after="0" w:before="0" w:line="240" w:lineRule="auto"/>
         <w:ind w:left="720" w:right="0" w:hanging="720"/>
@@ -13646,7 +13646,7 @@
     <w:p>
       <w:pPr>
         <w:tabs>
-          <w:tab w:val="left" w:leader="none" w:pos="0"/>
+          <w:tab w:val="left" w:leader="none" w:pos="720"/>
           <w:tab w:val="left" w:leader="none" w:pos="720"/>
           <w:tab w:val="left" w:leader="none" w:pos="1440"/>
           <w:tab w:val="left" w:leader="none" w:pos="2160"/>
@@ -13675,8 +13675,8 @@
       <w:pPr>
         <w:pStyle w:val="Heading3"/>
         <w:tabs>
-          <w:tab w:val="left" w:leader="none" w:pos="0"/>
-          <w:tab w:val="left" w:leader="none" w:pos="0"/>
+          <w:tab w:val="left" w:leader="none" w:pos="720"/>
+          <w:tab w:val="left" w:leader="none" w:pos="720"/>
         </w:tabs>
         <w:ind w:left="720" w:hanging="720"/>
         <w:jc w:val="both"/>
@@ -13713,7 +13713,7 @@
     <w:p>
       <w:pPr>
         <w:tabs>
-          <w:tab w:val="left" w:leader="none" w:pos="0"/>
+          <w:tab w:val="left" w:leader="none" w:pos="720"/>
           <w:tab w:val="left" w:leader="none" w:pos="720"/>
           <w:tab w:val="left" w:leader="none" w:pos="1440"/>
           <w:tab w:val="left" w:leader="none" w:pos="2160"/>
@@ -13742,8 +13742,8 @@
       <w:pPr>
         <w:pStyle w:val="Heading3"/>
         <w:tabs>
-          <w:tab w:val="left" w:leader="none" w:pos="0"/>
-          <w:tab w:val="left" w:leader="none" w:pos="0"/>
+          <w:tab w:val="left" w:leader="none" w:pos="720"/>
+          <w:tab w:val="left" w:leader="none" w:pos="720"/>
         </w:tabs>
         <w:ind w:left="720" w:hanging="720"/>
         <w:jc w:val="both"/>
@@ -13794,8 +13794,8 @@
       <w:pPr>
         <w:pStyle w:val="Heading3"/>
         <w:tabs>
-          <w:tab w:val="left" w:leader="none" w:pos="0"/>
-          <w:tab w:val="left" w:leader="none" w:pos="0"/>
+          <w:tab w:val="left" w:leader="none" w:pos="720"/>
+          <w:tab w:val="left" w:leader="none" w:pos="720"/>
         </w:tabs>
         <w:ind w:left="713" w:hanging="720"/>
         <w:jc w:val="both"/>
@@ -13846,8 +13846,8 @@
       <w:pPr>
         <w:pStyle w:val="Heading3"/>
         <w:tabs>
-          <w:tab w:val="left" w:leader="none" w:pos="0"/>
-          <w:tab w:val="left" w:leader="none" w:pos="0"/>
+          <w:tab w:val="left" w:leader="none" w:pos="720"/>
+          <w:tab w:val="left" w:leader="none" w:pos="720"/>
         </w:tabs>
         <w:ind w:left="720" w:hanging="720"/>
         <w:jc w:val="both"/>
@@ -13906,8 +13906,8 @@
       <w:pPr>
         <w:pStyle w:val="Heading3"/>
         <w:tabs>
-          <w:tab w:val="left" w:leader="none" w:pos="0"/>
-          <w:tab w:val="left" w:leader="none" w:pos="0"/>
+          <w:tab w:val="left" w:leader="none" w:pos="720"/>
+          <w:tab w:val="left" w:leader="none" w:pos="720"/>
         </w:tabs>
         <w:ind w:left="720" w:hanging="720"/>
         <w:jc w:val="both"/>
@@ -13943,8 +13943,8 @@
       <w:pPr>
         <w:pStyle w:val="Heading3"/>
         <w:tabs>
-          <w:tab w:val="left" w:leader="none" w:pos="0"/>
-          <w:tab w:val="left" w:leader="none" w:pos="0"/>
+          <w:tab w:val="left" w:leader="none" w:pos="720"/>
+          <w:tab w:val="left" w:leader="none" w:pos="720"/>
         </w:tabs>
         <w:ind w:left="720" w:hanging="720"/>
         <w:jc w:val="both"/>
@@ -13962,8 +13962,8 @@
       <w:pPr>
         <w:pStyle w:val="Heading3"/>
         <w:tabs>
-          <w:tab w:val="left" w:leader="none" w:pos="0"/>
-          <w:tab w:val="left" w:leader="none" w:pos="0"/>
+          <w:tab w:val="left" w:leader="none" w:pos="720"/>
+          <w:tab w:val="left" w:leader="none" w:pos="720"/>
         </w:tabs>
         <w:ind w:left="720" w:hanging="720"/>
         <w:jc w:val="both"/>
@@ -14075,7 +14075,7 @@
         </w:pBdr>
         <w:shd w:fill="auto" w:val="clear"/>
         <w:tabs>
-          <w:tab w:val="left" w:leader="none" w:pos="0"/>
+          <w:tab w:val="left" w:leader="none" w:pos="720"/>
           <w:tab w:val="left" w:leader="none" w:pos="2172"/>
           <w:tab w:val="left" w:leader="none" w:pos="4998"/>
         </w:tabs>
@@ -14161,10 +14161,10 @@
         <w:pStyle w:val="Heading4"/>
         <w:widowControl w:val="1"/>
         <w:tabs>
-          <w:tab w:val="left" w:leader="none" w:pos="0"/>
+          <w:tab w:val="left" w:leader="none" w:pos="720"/>
           <w:tab w:val="left" w:leader="none" w:pos="-1080"/>
           <w:tab w:val="left" w:leader="none" w:pos="-720"/>
-          <w:tab w:val="left" w:leader="none" w:pos="0"/>
+          <w:tab w:val="left" w:leader="none" w:pos="720"/>
           <w:tab w:val="left" w:leader="none" w:pos="720"/>
           <w:tab w:val="left" w:leader="none" w:pos="1440"/>
           <w:tab w:val="left" w:leader="none" w:pos="2340"/>
@@ -14303,7 +14303,7 @@
       <w:pPr>
         <w:widowControl w:val="1"/>
         <w:tabs>
-          <w:tab w:val="left" w:leader="none" w:pos="0"/>
+          <w:tab w:val="left" w:leader="none" w:pos="720"/>
           <w:tab w:val="left" w:leader="none" w:pos="720"/>
           <w:tab w:val="left" w:leader="none" w:pos="1440"/>
           <w:tab w:val="left" w:leader="none" w:pos="2160"/>
@@ -14332,7 +14332,7 @@
       <w:pPr>
         <w:widowControl w:val="1"/>
         <w:tabs>
-          <w:tab w:val="left" w:leader="none" w:pos="0"/>
+          <w:tab w:val="left" w:leader="none" w:pos="720"/>
           <w:tab w:val="left" w:leader="none" w:pos="720"/>
           <w:tab w:val="left" w:leader="none" w:pos="1440"/>
           <w:tab w:val="left" w:leader="none" w:pos="2160"/>
@@ -14791,7 +14791,7 @@
       <w:pPr>
         <w:widowControl w:val="1"/>
         <w:tabs>
-          <w:tab w:val="left" w:leader="none" w:pos="0"/>
+          <w:tab w:val="left" w:leader="none" w:pos="720"/>
           <w:tab w:val="left" w:leader="none" w:pos="720"/>
           <w:tab w:val="left" w:leader="none" w:pos="1440"/>
           <w:tab w:val="left" w:leader="none" w:pos="2160"/>
@@ -14821,7 +14821,7 @@
       <w:pPr>
         <w:widowControl w:val="1"/>
         <w:tabs>
-          <w:tab w:val="left" w:leader="none" w:pos="0"/>
+          <w:tab w:val="left" w:leader="none" w:pos="720"/>
           <w:tab w:val="left" w:leader="none" w:pos="720"/>
           <w:tab w:val="left" w:leader="none" w:pos="1440"/>
           <w:tab w:val="left" w:leader="none" w:pos="2160"/>
@@ -14867,7 +14867,7 @@
       <w:pPr>
         <w:widowControl w:val="1"/>
         <w:tabs>
-          <w:tab w:val="left" w:leader="none" w:pos="0"/>
+          <w:tab w:val="left" w:leader="none" w:pos="720"/>
           <w:tab w:val="left" w:leader="none" w:pos="720"/>
           <w:tab w:val="left" w:leader="none" w:pos="1440"/>
           <w:tab w:val="left" w:leader="none" w:pos="2160"/>
@@ -14995,7 +14995,7 @@
       <w:pPr>
         <w:widowControl w:val="1"/>
         <w:tabs>
-          <w:tab w:val="left" w:leader="none" w:pos="0"/>
+          <w:tab w:val="left" w:leader="none" w:pos="720"/>
           <w:tab w:val="left" w:leader="none" w:pos="720"/>
           <w:tab w:val="left" w:leader="none" w:pos="1440"/>
           <w:tab w:val="left" w:leader="none" w:pos="2160"/>
@@ -15026,7 +15026,7 @@
       <w:pPr>
         <w:widowControl w:val="1"/>
         <w:tabs>
-          <w:tab w:val="left" w:leader="none" w:pos="0"/>
+          <w:tab w:val="left" w:leader="none" w:pos="720"/>
           <w:tab w:val="left" w:leader="none" w:pos="720"/>
           <w:tab w:val="left" w:leader="none" w:pos="1440"/>
           <w:tab w:val="left" w:leader="none" w:pos="2160"/>
@@ -15057,7 +15057,7 @@
       <w:pPr>
         <w:widowControl w:val="1"/>
         <w:tabs>
-          <w:tab w:val="left" w:leader="none" w:pos="0"/>
+          <w:tab w:val="left" w:leader="none" w:pos="720"/>
           <w:tab w:val="left" w:leader="none" w:pos="720"/>
           <w:tab w:val="left" w:leader="none" w:pos="1440"/>
           <w:tab w:val="left" w:leader="none" w:pos="2160"/>
@@ -15095,7 +15095,7 @@
       <w:pPr>
         <w:widowControl w:val="1"/>
         <w:tabs>
-          <w:tab w:val="left" w:leader="none" w:pos="0"/>
+          <w:tab w:val="left" w:leader="none" w:pos="720"/>
           <w:tab w:val="left" w:leader="none" w:pos="720"/>
           <w:tab w:val="left" w:leader="none" w:pos="1440"/>
           <w:tab w:val="left" w:leader="none" w:pos="2160"/>

</xml_diff>

<commit_message>
fix(template): tighten Successor's Interest forced-sale wording + split §14.7 trailing paragraph
Two text-level fixes to corp_template.docx from Antonio's 2026-05-15 review:

§14.5.A (todo 04) — "The Successor may retain the interest or sell the
interest." reads as discretionary, but the surrounding article governs an
involuntary/forced sale. Reword to "The Successor shall be required to
sell the interest." so the obligation is unambiguous.

§14.7 → §14.8 (todo 05) — the long "If the Corporation fails to notify…"
paragraph at the tail of Payment Upon Withdrawal was a continuation of
§14.7, but its subject (effect when the Corporation declines to purchase)
is logically its own section. Promote it to a Heading3-styled paragraph
with the title "Failure to Purchase"; the renumberAndRemapSubsections
pass will assign it §14.8 at generation time.

Refs: Antonio review video 2026-05-15 (todos 04, 05)

Co-Authored-By: Claude Opus 4.7 (1M context) <noreply@anthropic.com>
</commit_message>
<xml_diff>
--- a/templates/corp_template.docx
+++ b/templates/corp_template.docx
@@ -12909,7 +12909,7 @@
           <w:vertAlign w:val="baseline"/>
           <w:rtl w:val="0"/>
         </w:rPr>
-        <w:t xml:space="preserve">The Successor may retain the interest or sell the interest.  The Corporation shall have the first option to purchase the Successor or Involuntary Assignee’s interest within 60 days from the death, incapacity or divorce of the Withdrawing Shareholder.  The Corporation’s decision to exercise its option to purchase shall be within the sole discretion of a Majority vote of the Board of Directors and the Shareholders.  The Corporation must notify the Successor of the decision to acquire such Shares in writing within 60 days.  </w:t>
+        <w:t xml:space="preserve">The Successor shall be required to sell the interest.  The Corporation shall have the first option to purchase the Successor or Involuntary Assignee’s interest within 60 days from the death, incapacity or divorce of the Withdrawing Shareholder.  The Corporation’s decision to exercise its option to purchase shall be within the sole discretion of a Majority vote of the Board of Directors and the Shareholders.  The Corporation must notify the Successor of the decision to acquire such Shares in writing within 60 days.  </w:t>
       </w:r>
     </w:p>
     <w:p>
@@ -13203,21 +13203,45 @@
     </w:p>
     <w:p>
       <w:pPr>
-        <w:tabs>
-          <w:tab w:val="left" w:leader="none" w:pos="1080"/>
-        </w:tabs>
-        <w:ind w:left="1420" w:hanging="656"/>
-        <w:jc w:val="both"/>
-        <w:rPr>
-          <w:vertAlign w:val="baseline"/>
-        </w:rPr>
-      </w:pPr>
-      <w:r>
-        <w:rPr>
-          <w:vertAlign w:val="baseline"/>
-          <w:rtl w:val="0"/>
-        </w:rPr>
-        <w:t xml:space="preserve">If the Corporation fails to notify the Divorcing Shareholder, Successor or Involuntary Assignee of its decision within the 60-day Period, or if the Corporation notifies such parties that it will not purchase the Shares, the Divorcing Shareholder, Successor, or Involuntary Assignee shall become a shareholder, provided that such party becomes a party to this Agreement.  Once such Successor or Involuntary Assignee becomes a Shareholder, they shall have the rights and limitations set for in this Agreement for such Class of Shares.  Alternatively, such Divorcing Shareholder, Successor or Involuntary Assignee may at this time elect to sell the Shares to a third party, at the fair market value (but no less than any offer received from or made to the Corporation, if applicable) and pursuant to Section 13 above, provided the Shareholders by Majority approve such new shareholder.  All future attempted transfers will be subject to this Shareholders' Agreement and require the Majority approval of the Shareholders, except that the Personal Representative may transfer the Shares to the deceased Shareholder's beneficiaries, provided the beneficiaries become parties to this Shareholders' Agreement and become Shareholders for purposes of this Shareholders' Agreement.</w:t>
+        <w:pStyle w:val="Heading3"/>
+        <w:tabs>
+          <w:tab w:val="left" w:leader="none" w:pos="720"/>
+          <w:tab w:val="left" w:leader="none" w:pos="720"/>
+          <w:tab w:val="left" w:leader="none" w:pos="1440"/>
+          <w:tab w:val="left" w:leader="none" w:pos="2160"/>
+          <w:tab w:val="left" w:leader="none" w:pos="5040"/>
+          <w:tab w:val="left" w:leader="none" w:pos="5760"/>
+          <w:tab w:val="left" w:leader="none" w:pos="6480"/>
+          <w:tab w:val="left" w:leader="none" w:pos="7200"/>
+          <w:tab w:val="left" w:leader="none" w:pos="7920"/>
+          <w:tab w:val="left" w:leader="none" w:pos="8640"/>
+          <w:tab w:val="left" w:leader="none" w:pos="9360"/>
+          <w:tab w:val="left" w:leader="none" w:pos="10080"/>
+          <w:tab w:val="left" w:leader="none" w:pos="10800"/>
+          <w:tab w:val="left" w:leader="none" w:pos="11520"/>
+          <w:tab w:val="left" w:leader="none" w:pos="12240"/>
+          <w:tab w:val="left" w:leader="none" w:pos="12960"/>
+        </w:tabs>
+        <w:ind w:left="1440" w:hanging="720"/>
+        <w:jc w:val="both"/>
+        <w:rPr>
+          <w:vertAlign w:val="baseline"/>
+        </w:rPr>
+      </w:pPr>
+      <w:r>
+        <w:rPr>
+          <w:u w:val="single"/>
+          <w:vertAlign w:val="baseline"/>
+          <w:rtl w:val="0"/>
+        </w:rPr>
+        <w:t xml:space="preserve">Failure to Purchase</w:t>
+      </w:r>
+      <w:r>
+        <w:rPr>
+          <w:vertAlign w:val="baseline"/>
+          <w:rtl w:val="0"/>
+        </w:rPr>
+        <w:t xml:space="preserve">.  If the Corporation fails to notify the Divorcing Shareholder, Successor or Involuntary Assignee of its decision within the 60-day Period, or if the Corporation notifies such parties that it will not purchase the Shares, the Divorcing Shareholder, Successor, or Involuntary Assignee shall become a shareholder, provided that such party becomes a party to this Agreement.  Once such Successor or Involuntary Assignee becomes a Shareholder, they shall have the rights and limitations set for in this Agreement for such Class of Shares.  Alternatively, such Divorcing Shareholder, Successor or Involuntary Assignee may at this time elect to sell the Shares to a third party, at the fair market value (but no less than any offer received from or made to the Corporation, if applicable) and pursuant to Section 13 above, provided the Shareholders by Majority approve such new shareholder.  All future attempted transfers will be subject to this Shareholders' Agreement and require the Majority approval of the Shareholders, except that the Personal Representative may transfer the Shares to the deceased Shareholder's beneficiaries, provided the beneficiaries become parties to this Shareholders' Agreement and become Shareholders for purposes of this Shareholders' Agreement.</w:t>
       </w:r>
     </w:p>
     <w:p>

</xml_diff>